<commit_message>
docs: refocus paper on human-agent process interaction
Rename the working title and align the introduction, task analysis and research outline around goal delegation, process outputs, user participation and result feedback. Preserve the long-duration spatial scenarios and M1–M3 mechanisms; distinguish proposed work from implementation and evaluation results.
</commit_message>
<xml_diff>
--- a/paper/thesis.docx
+++ b/paper/thesis.docx
@@ -8,7 +8,10 @@
         <w:jc w:val="center"/>
       </w:pPr>
       <w:r>
-        <w:t>面向长时空间任务的智能体协同交互机制设计与实现</w:t>
+        <w:rPr>
+          <w:color w:val="000000"/>
+        </w:rPr>
+        <w:t>面向长时空间任务的人—智能体交互机制设计与实现</w:t>
       </w:r>
     </w:p>
     <w:p>
@@ -16,6 +19,9 @@
         <w:pStyle w:val="Heading1"/>
       </w:pPr>
       <w:r>
+        <w:rPr>
+          <w:color w:val="000000"/>
+        </w:rPr>
         <w:t>1 引言</w:t>
       </w:r>
     </w:p>
@@ -24,6 +30,9 @@
         <w:pStyle w:val="Heading2"/>
       </w:pPr>
       <w:r>
+        <w:rPr>
+          <w:color w:val="000000"/>
+        </w:rPr>
         <w:t>1.1 研究背景</w:t>
       </w:r>
     </w:p>
@@ -32,7 +41,13 @@
         <w:jc w:val="both"/>
       </w:pPr>
       <w:r>
-        <w:t>在由多类无人平台共同执行的持续性任务中，操作员需要通过终端了解设备群正在完成哪些工作，并在目标、环境或执行条件变化时作出调整。设备自主执行和自主接替，使操作员可以围绕任务目标开展监督；与此同时，执行对象、任务分工与空间范围会随过程变化，用户需要把设备状态与整体任务联系起来，才能判断当前安排是否仍符合要求。面向这一工作形态，交互界面承担着任务理解、调整表达和执行反馈之间的衔接作用。</w:t>
+        <w:t>传统任务界面通常把业务能力组织为页面、菜单、表单和按钮，用户根据目标选择功能、输入参数，并通过连续操作推进任务。例如，用户希望增加某一区域的巡查，可能需要找到任务、选择区域、修改安排并提交。此类界面同样可以围绕用户需求设计，但在具体操作中，往往由用户将目标转化为系统可执行的步骤。</w:t>
+      </w:r>
+    </w:p>
+    <w:p>
+      <w:pPr/>
+      <w:r>
+        <w:t>在本文关注的Agent应用中，用户可以表达任务目标和约束，由智能体解释要求、组织计划、调用工具并持续执行。用户的目标不必完全对应一个预先固定的操作流程，智能体还可能提出澄清、请求取舍或根据执行情况调整安排。人与系统的交互因此延伸为目标表达、理解确认、过程监督、必要介入和结果核查。自然语言、地图操作和结构化控件可以共同承担这些交互，既有直接操作也可以保留。</w:t>
       </w:r>
     </w:p>
     <w:p>
@@ -40,7 +55,7 @@
         <w:jc w:val="both"/>
       </w:pPr>
       <w:r>
-        <w:t>本文所讨论的长时空间任务，是指持续数小时以上、执行对象分布于地理空间的任务。时间维度涉及已有进展、当前执行、后续安排及多次调整之间的关系；空间维度涉及设备位置、任务区域、路径和作用范围。以持续区域巡查为例，某一设备离开当前区域，可能是完成工作后的正常转移，也可能是设备接替引起的分工变化。操作员作出判断所需的信息，既包括设备当前位置，也包括该区域的完成情况、变化前后的任务归属与后续安排。</w:t>
+        <w:t>随着智能体推进任务，系统会产生对要求的解释、计划、工具调用、执行进度、关键变化、异常、征询和结果等多类输出。这些输出具有不同的含义、重要程度和持续时间，用户也不需要逐条阅读所有事件。交互设计需要回答：哪些信息应当呈现，怎样组织这些信息，何时需要吸引用户注意，以及用户如何在执行中补充或修正要求。单纯按时间堆叠消息难以直接说明任务整体关系，而固定状态栏也未必能充分承载不断变化的协作过程；具体不足及设计收益仍需在任务条件下检验。</w:t>
       </w:r>
     </w:p>
     <w:p>
@@ -48,7 +63,7 @@
         <w:jc w:val="both"/>
       </w:pPr>
       <w:r>
-        <w:t>情境感知理论将动态任务中的状态感知、意义理解和后续状态预测联系起来，为分析操作员需要获取和理解的信息提供了基础[1]。据此，本文将执行理解具体化为对任务事实、目标关系和后续影响的判断，并进一步考察这些判断如何支持用户操作。长时任务背景在此用于界定过程演化与多次参与的条件，人员疲劳或长期警觉性的变化需另行研究。</w:t>
+        <w:t>本文以长时空间任务作为上述交互问题的应用与验证背景。长时空间指任务持续数小时以上、执行对象分布于地理空间；用户需要结合任务进展、设备、区域与路径理解执行，并可能多次参与调整。情境感知理论关于感知、理解与预测的区分[1]，为确定过程信息应支持哪些判断提供分析依据。论文研究的是人与智能体的交互机制，设备控制和多智能体内部协同是支撑能力。</w:t>
       </w:r>
     </w:p>
     <w:p>
@@ -56,7 +71,10 @@
         <w:pStyle w:val="Heading2"/>
       </w:pPr>
       <w:r>
-        <w:t>1.2 已有研究与问题提出</w:t>
+        <w:rPr>
+          <w:color w:val="000000"/>
+        </w:rPr>
+        <w:t>1.2 已有研究与交互问题</w:t>
       </w:r>
     </w:p>
     <w:p>
@@ -64,7 +82,7 @@
         <w:jc w:val="both"/>
       </w:pPr>
       <w:r>
-        <w:t>空间表达与任务规划的结合已有研究基础。Szafir等面向室内飞行机器人设计了三类交互原型，其中协作界面将三维空间航点与可编辑时间线结合，支持任务顺序调整和人机依赖关系表达，并在其任务条件下改善了用户完成任务及响应变化的表现[2]。该工作说明空间与时间信息可以共同进入用户操作过程，也为本研究提供了可比较的设计方案。其对象与本文的异构设备群监督场景存在差异，已有机制在自主接替和多次任务调整中的适用方式仍需结合业务分析与原型评价确定。</w:t>
+        <w:t>空间表达与任务规划的结合已有研究基础。Szafir等面向室内飞行机器人设计了三类交互原型，其中协作界面结合三维空间航点与可编辑时间线，支持任务顺序调整和人机依赖关系表达，并在其任务条件下改善了任务完成及响应变化的表现[2]。该研究为任务过程与空间操作的结合提供了比较方案。本文进一步关注持续执行中，用户如何从多类输出理解任务、表达新要求，并衔接调整后的执行。</w:t>
       </w:r>
     </w:p>
     <w:p>
@@ -72,7 +90,7 @@
         <w:jc w:val="both"/>
       </w:pPr>
       <w:r>
-        <w:t>用户需要理解的信息也会随协作情境改变。Senaratne等通过对16名具有人机团队实践经验的参与者开展访谈，提出动态情境感知框架，指出所需情境感知与任务条件、成员角色和能力有关[3]。这一研究为按任务需要组织信息提供了依据，但其访谈发现不能直接作为本文应用现场的需求证据，也不能据此认定某种界面有效。本文据此关注监督、调整与结果核查之间的信息需求变化，并在具体设计中检验信息组织方式。</w:t>
+        <w:t>信息需求也会随协作情境改变。Senaratne等通过对16名具有人机团队实践经验的参与者开展访谈，提出动态情境感知框架，指出所需情境感知与任务条件、成员角色和能力有关[3]。这为按用户当前判断与操作需要选择信息提供了依据，但不能直接证明某种界面有效，也不能代替本研究的需求核查。</w:t>
       </w:r>
     </w:p>
     <w:p>
@@ -80,7 +98,20 @@
         <w:jc w:val="both"/>
       </w:pPr>
       <w:r>
-        <w:t>本文的工程动机来自应用单位尚缺少满足上述协作过程的交互实现。围绕这一建设需求，需要进一步回答：用户查看空间对象时，怎样理解与之相关的任务过程；表达新的空间要求时，怎样明确调整对象、范围和生效条件；系统完成自主调整或接受人工要求后，用户怎样判断实际变化及其影响。现有功能的缺失说明系统建设的必要性，而具体研究贡献仍应通过已有方案比较、设计理由和评价证据加以界定。</w:t>
+        <w:t>本文的工程动机来自现有应用接入智能体能力后的交互建设需要。后台能够解释目标并推进任务后，前端还需把持续输出组织成用户可以理解和参与的过程。本文关注三个相互衔接的问题：如何从多类输出中突出用户所需的信息，使其理解智能体正在做什么；如何支持用户在执行过程中澄清、选择和调整；如何呈现调整后的执行与最终结果，使用户判断原要求是否得到满足。</w:t>
+      </w:r>
+    </w:p>
+    <w:p>
+      <w:pPr/>
+      <w:commentRangeStart w:id="0"/>
+      <w:r>
+        <w:t>传统操作界面、按时间排列的消息流及已有过程可视化方案，是分析这些问题的比较入口。比较重点包括谁将目标转化为步骤、过程信息如何组织、用户从哪里参与以及结果如何对应要求，而不是预先认定Agent交互优于传统界面。本文拟在相同后台能力、任务信息和基本操作条件下，检验所提出的信息组织与参与方式是否帮助用户理解和完成任务，并记录额外阅读、确认和操作成本。</w:t>
+      </w:r>
+      <w:commentRangeEnd w:id="0"/>
+      <w:r>
+        <w:rPr>
+          <w:rStyle w:val="CommentReference"/>
+        </w:rPr>
       </w:r>
     </w:p>
     <w:p>
@@ -88,7 +119,10 @@
         <w:pStyle w:val="Heading2"/>
       </w:pPr>
       <w:r>
-        <w:t>1.3 研究目标与内容</w:t>
+        <w:rPr>
+          <w:color w:val="000000"/>
+        </w:rPr>
+        <w:t>1.3 研究目标与范围</w:t>
       </w:r>
     </w:p>
     <w:p>
@@ -96,7 +130,7 @@
         <w:jc w:val="both"/>
       </w:pPr>
       <w:r>
-        <w:t>本文研究的问题是：在长时空间任务持续执行和变化的过程中，如何通过空间交互界面支持用户理解设备群的执行情况、准确表达和实施调整，并判断调整与任务结果是否符合要求。研究聚焦面向用户的交互层，复用设备控制、任务规划及自主接替能力。操作员可在业务权限内否决或修改安排，自主执行过程中能够由系统处理的变化则继续按既有规则运行。</w:t>
+        <w:t>本文研究的问题是：在长时空间任务中，当用户以目标和约束委托智能体持续执行时，如何组织执行过程中的多类输出，支持用户理解进展、在必要时参与调整，并判断结果是否符合要求。研究聚焦人与智能体交互，不开展任务规划、平台控制或多智能体内部编排算法研究。操作员保留业务允许的直接操作和调整方式，不要求所有任务都通过自然语言完成。</w:t>
       </w:r>
     </w:p>
     <w:p>
@@ -104,7 +138,7 @@
         <w:jc w:val="both"/>
       </w:pPr>
       <w:r>
-        <w:t>围绕上述问题，本文设置两个目标。一是支持任务过程理解，考察用户对当前状态、关键变化、任务目标和后续安排的判断；二是支持有效介入与结果确认，考察用户能否准确表达调整、在合理条件下介入，并识别要求的实际落实情况。用户体验由理解正确性、对象与范围错误、操作耗时和主观负担等共同反映，评价时分别记录后台执行结果与用户对结果的判断。</w:t>
+        <w:t>本文设置两个目标。G1是支持过程理解，使用户知道智能体理解了什么、准备做什么、执行到哪里以及关键变化意味着什么；G2是支持有效参与，使用户能够在需要时澄清或修改要求，并确认调整及任务结果。评价分别观察理解正确性、信息遗漏、调整表达错误、结果判断与操作负担，区分实际执行结果和用户对结果的理解。</w:t>
       </w:r>
     </w:p>
     <w:p>
@@ -112,7 +146,30 @@
         <w:jc w:val="both"/>
       </w:pPr>
       <w:r>
-        <w:t>研究内容按执行信息组织与呈现、用户与智能体的协同介入、执行衔接与反馈三项机制展开。空间交互是重点探索方向：任务、设备、区域与路径既构成用户理解执行的参照，也构成表达调整和核查结果的操作对象。本文拟通过场景分析形成需求，在原型中实现相互衔接的交互流程，并以功能验证和用户任务评价考察其适用性。交互机制及其实现方法的贡献，将依据实际设计差异与验证结果确定。</w:t>
+        <w:t>围绕两个目标，设置两个评价问题。EQ1考察在相同任务信息可获得的条件下，本文方案是否帮助用户更准确地理解当前执行、关键变化与后续影响；EQ2考察用户是否能够准确表达调整、作出合理介入，并识别已落实、部分落实、拒绝、失败或未知。系统实际长时运行、短时人员任务和人员长期监督分别报告，结论限于实际覆盖条件。</w:t>
+      </w:r>
+    </w:p>
+    <w:p>
+      <w:pPr>
+        <w:pStyle w:val="Heading2"/>
+      </w:pPr>
+      <w:r>
+        <w:rPr>
+          <w:color w:val="000000"/>
+        </w:rPr>
+        <w:t>1.4 本文工作与预期贡献</w:t>
+      </w:r>
+    </w:p>
+    <w:p>
+      <w:pPr/>
+      <w:r>
+        <w:t>本文拟形成三个方面的工作：分析从用户逐步操作到目标委托执行的交互变化，提炼过程理解与用户参与需求；设计执行信息组织与呈现、协同介入、执行衔接与反馈三项机制，并以地图任务原型实现相互衔接的流程；通过正常监督、新增区域和自主接替等案例，验证功能及状态关系，评价用户理解、操作和结果判断。</w:t>
+      </w:r>
+    </w:p>
+    <w:p>
+      <w:pPr/>
+      <w:r>
+        <w:t>预期产出包括适用于多类过程输出的信息组织要求、支持双向发起的参与流程、与任务要求对应的结果反馈，以及原型与评价记录。空间对象与任务过程的关联、空间操作与要求表达的衔接是优先探索方向。具体机制相对于已有方案的增量价值，依据比较与验证结果确定。</w:t>
       </w:r>
     </w:p>
     <w:p>
@@ -120,7 +177,10 @@
         <w:pStyle w:val="Heading1"/>
       </w:pPr>
       <w:r>
-        <w:t>3 任务场景与需求分析</w:t>
+        <w:rPr>
+          <w:color w:val="000000"/>
+        </w:rPr>
+        <w:t>3 长时空间任务分析与人—智能体交互框架</w:t>
       </w:r>
     </w:p>
     <w:p>
@@ -128,6 +188,9 @@
         <w:pStyle w:val="Heading2"/>
       </w:pPr>
       <w:r>
+        <w:rPr>
+          <w:color w:val="000000"/>
+        </w:rPr>
         <w:t>3.1 应用场景与角色职责</w:t>
       </w:r>
     </w:p>
@@ -136,7 +199,7 @@
         <w:jc w:val="both"/>
       </w:pPr>
       <w:r>
-        <w:t>研究场景为操作员通过现有终端远程监督异构无人平台班组完成长时空间任务。班组包含空中、地面和四足平台，各类平台由相应执行智能体控制，信息处理、态势分析和任务规划智能体提供支撑。这里的智能体指承担任务执行或协作职责的软件实体；界面按用户的任务需要呈现其相关行为和结果，具体内部实现不改变本章对交互职责的划分。</w:t>
+        <w:t>本章将前述人与智能体交互问题放入长时空间任务中分析。操作员通过终端提出任务目标和约束，智能体组织设备群执行；终端呈现理解确认、计划、进度、关键变化、必要征询和结果，操作员据此继续监督或参与调整。系统背景为空中、地面和四足平台组成的异构班组，执行智能体及信息处理、态势分析、任务规划智能体共同提供支撑。用户侧围绕任务开展交互，无须逐一理解或操作内部智能体。</w:t>
       </w:r>
     </w:p>
     <w:p>
@@ -160,6 +223,9 @@
         <w:pStyle w:val="Heading2"/>
       </w:pPr>
       <w:r>
+        <w:rPr>
+          <w:color w:val="000000"/>
+        </w:rPr>
         <w:t>3.2 长时空间任务的交互特征</w:t>
       </w:r>
     </w:p>
@@ -168,7 +234,7 @@
         <w:jc w:val="both"/>
       </w:pPr>
       <w:r>
-        <w:t>持续执行使同一任务包含多个时间参照。用户查看当前状态时，可能需要知道形成该状态的关键变化；提出新要求时，需要区分已经完成的工作、仍在执行的工作和可以调整的后续安排。例如，“后续增加该区域的复查频次”与“立即重做该区域已完成的检查”涉及相同空间对象，却具有不同的时间范围和执行含义。界面需要使这些区别进入表达与确认过程，并在再次查看时保留相关上下文。</w:t>
+        <w:t>任务持续执行时，一次目标委托会产生多种过程输出。对要求的解释用于检查理解是否一致，计划说明准备做什么，进度反映执行到哪里，征询要求用户作出决定，结果支持完成情况核查。这些信息应围绕任务及当前需要组织，而不是把每次工具调用和内部事件都作为同等重要的消息。用户应能够查看必要依据，也能够从简明的任务状态进入相关详情。</w:t>
       </w:r>
     </w:p>
     <w:p>
@@ -192,7 +258,7 @@
         <w:jc w:val="both"/>
       </w:pPr>
       <w:r>
-        <w:t>多次参与要求交互保持连续。用户可能在一次查看中只确认正常执行，在另一次查看中提出调整，也可能在调整尚未完全落实时再次参与。若每次进入都需重新辨认任务、对象和既有决定，操作成本可能增加。由此提出的设计要求是保留必要的任务关联与调整记录，并让用户区分历史信息、当前事实与后续计划；其具体收益及信息负担需在评价中同时考察。</w:t>
+        <w:t>多次参与要求交互保持连续。用户可以在执行中查看进展、补充约束或调整范围，智能体也可以因缺少信息或存在取舍而发起征询。界面需要让用户明确当前是否需要行动、决定针对哪项任务，以及提交后发生了什么。输入、确认和反馈沿用必要的上下文，避免每次参与都重新解释任务；确认条件实质变化时再更新说明。</w:t>
       </w:r>
     </w:p>
     <w:p>
@@ -200,6 +266,9 @@
         <w:pStyle w:val="Heading2"/>
       </w:pPr>
       <w:r>
+        <w:rPr>
+          <w:color w:val="000000"/>
+        </w:rPr>
         <w:t>3.3 完整工作过程与协作情境</w:t>
       </w:r>
     </w:p>
@@ -258,30 +327,37 @@
         <w:trPr>
           <w:cantSplit/>
           <w:tblHeader/>
+          <w:tblHeader/>
         </w:trPr>
         <w:tc>
           <w:tcPr>
-            <w:tcW w:type="dxa" w:w="1644"/>
+            <w:tcW w:type="dxa" w:w="1944"/>
             <w:vAlign w:val="center"/>
             <w:tcMar>
               <w:top w:w="85" w:type="dxa"/>
               <w:bottom w:w="85" w:type="dxa"/>
               <w:left w:w="100" w:type="dxa"/>
               <w:right w:w="100" w:type="dxa"/>
+              <w:top w:w="75" w:type="dxa"/>
+              <w:bottom w:w="75" w:type="dxa"/>
+              <w:left w:w="75" w:type="dxa"/>
+              <w:right w:w="75" w:type="dxa"/>
             </w:tcMar>
             <w:shd w:fill="E8EDF2"/>
           </w:tcPr>
           <w:p>
             <w:pPr>
               <w:keepNext/>
-              <w:spacing w:after="0" w:line="300" w:lineRule="exact"/>
+              <w:spacing w:after="60" w:line="276" w:lineRule="auto" w:before="0"/>
               <w:ind w:firstLine="0"/>
               <w:jc w:val="center"/>
             </w:pPr>
             <w:r>
               <w:rPr>
+                <w:rFonts w:ascii="Times New Roman" w:hAnsi="Times New Roman" w:eastAsia="宋体"/>
                 <w:b/>
-                <w:sz w:val="20"/>
+                <w:color w:val="000000"/>
+                <w:sz w:val="21"/>
               </w:rPr>
               <w:t>情境</w:t>
             </w:r>
@@ -289,27 +365,33 @@
         </w:tc>
         <w:tc>
           <w:tcPr>
-            <w:tcW w:type="dxa" w:w="4535"/>
+            <w:tcW w:type="dxa" w:w="4968"/>
             <w:vAlign w:val="center"/>
             <w:tcMar>
               <w:top w:w="85" w:type="dxa"/>
               <w:bottom w:w="85" w:type="dxa"/>
               <w:left w:w="100" w:type="dxa"/>
               <w:right w:w="100" w:type="dxa"/>
+              <w:top w:w="75" w:type="dxa"/>
+              <w:bottom w:w="75" w:type="dxa"/>
+              <w:left w:w="75" w:type="dxa"/>
+              <w:right w:w="75" w:type="dxa"/>
             </w:tcMar>
             <w:shd w:fill="E8EDF2"/>
           </w:tcPr>
           <w:p>
             <w:pPr>
               <w:keepNext/>
-              <w:spacing w:after="0" w:line="300" w:lineRule="exact"/>
+              <w:spacing w:after="60" w:line="276" w:lineRule="auto" w:before="0"/>
               <w:ind w:firstLine="0"/>
-              <w:jc w:val="left"/>
+              <w:jc w:val="center"/>
             </w:pPr>
             <w:r>
               <w:rPr>
+                <w:rFonts w:ascii="Times New Roman" w:hAnsi="Times New Roman" w:eastAsia="宋体"/>
                 <w:b/>
-                <w:sz w:val="20"/>
+                <w:color w:val="000000"/>
+                <w:sz w:val="21"/>
               </w:rPr>
               <w:t>主要用户任务</w:t>
             </w:r>
@@ -317,27 +399,33 @@
         </w:tc>
         <w:tc>
           <w:tcPr>
-            <w:tcW w:type="dxa" w:w="2778"/>
+            <w:tcW w:type="dxa" w:w="2030"/>
             <w:vAlign w:val="center"/>
             <w:tcMar>
               <w:top w:w="85" w:type="dxa"/>
               <w:bottom w:w="85" w:type="dxa"/>
               <w:left w:w="100" w:type="dxa"/>
               <w:right w:w="100" w:type="dxa"/>
+              <w:top w:w="75" w:type="dxa"/>
+              <w:bottom w:w="75" w:type="dxa"/>
+              <w:left w:w="75" w:type="dxa"/>
+              <w:right w:w="75" w:type="dxa"/>
             </w:tcMar>
             <w:shd w:fill="E8EDF2"/>
           </w:tcPr>
           <w:p>
             <w:pPr>
               <w:keepNext/>
-              <w:spacing w:after="0" w:line="300" w:lineRule="exact"/>
+              <w:spacing w:after="60" w:line="276" w:lineRule="auto" w:before="0"/>
               <w:ind w:firstLine="0"/>
-              <w:jc w:val="left"/>
+              <w:jc w:val="center"/>
             </w:pPr>
             <w:r>
               <w:rPr>
+                <w:rFonts w:ascii="Times New Roman" w:hAnsi="Times New Roman" w:eastAsia="宋体"/>
                 <w:b/>
-                <w:sz w:val="20"/>
+                <w:color w:val="000000"/>
+                <w:sz w:val="21"/>
               </w:rPr>
               <w:t>交互结果</w:t>
             </w:r>
@@ -350,26 +438,33 @@
         </w:trPr>
         <w:tc>
           <w:tcPr>
-            <w:tcW w:type="dxa" w:w="1644"/>
+            <w:tcW w:type="dxa" w:w="1944"/>
             <w:vAlign w:val="center"/>
             <w:tcMar>
               <w:top w:w="85" w:type="dxa"/>
               <w:bottom w:w="85" w:type="dxa"/>
               <w:left w:w="100" w:type="dxa"/>
               <w:right w:w="100" w:type="dxa"/>
+              <w:top w:w="75" w:type="dxa"/>
+              <w:bottom w:w="75" w:type="dxa"/>
+              <w:left w:w="75" w:type="dxa"/>
+              <w:right w:w="75" w:type="dxa"/>
             </w:tcMar>
+            <w:shd w:fill="FFFFFF"/>
           </w:tcPr>
           <w:p>
             <w:pPr>
               <w:keepNext w:val="0"/>
-              <w:spacing w:after="0" w:line="300" w:lineRule="exact"/>
+              <w:spacing w:after="60" w:line="276" w:lineRule="auto" w:before="0"/>
               <w:ind w:firstLine="0"/>
-              <w:jc w:val="center"/>
+              <w:jc w:val="left"/>
             </w:pPr>
             <w:r>
               <w:rPr>
+                <w:rFonts w:ascii="Times New Roman" w:hAnsi="Times New Roman" w:eastAsia="宋体"/>
                 <w:b w:val="0"/>
-                <w:sz w:val="20"/>
+                <w:color w:val="000000"/>
+                <w:sz w:val="21"/>
               </w:rPr>
               <w:t>S1 目标委托</w:t>
             </w:r>
@@ -377,26 +472,33 @@
         </w:tc>
         <w:tc>
           <w:tcPr>
-            <w:tcW w:type="dxa" w:w="4535"/>
+            <w:tcW w:type="dxa" w:w="4968"/>
             <w:vAlign w:val="center"/>
             <w:tcMar>
               <w:top w:w="85" w:type="dxa"/>
               <w:bottom w:w="85" w:type="dxa"/>
               <w:left w:w="100" w:type="dxa"/>
               <w:right w:w="100" w:type="dxa"/>
+              <w:top w:w="75" w:type="dxa"/>
+              <w:bottom w:w="75" w:type="dxa"/>
+              <w:left w:w="75" w:type="dxa"/>
+              <w:right w:w="75" w:type="dxa"/>
             </w:tcMar>
+            <w:shd w:fill="FFFFFF"/>
           </w:tcPr>
           <w:p>
             <w:pPr>
               <w:keepNext w:val="0"/>
-              <w:spacing w:after="0" w:line="300" w:lineRule="exact"/>
+              <w:spacing w:after="60" w:line="276" w:lineRule="auto" w:before="0"/>
               <w:ind w:firstLine="0"/>
               <w:jc w:val="left"/>
             </w:pPr>
             <w:r>
               <w:rPr>
+                <w:rFonts w:ascii="Times New Roman" w:hAnsi="Times New Roman" w:eastAsia="宋体"/>
                 <w:b w:val="0"/>
-                <w:sz w:val="20"/>
+                <w:color w:val="000000"/>
+                <w:sz w:val="21"/>
               </w:rPr>
               <w:t>表达任务区域、目标与约束，确认系统理解</w:t>
             </w:r>
@@ -404,26 +506,33 @@
         </w:tc>
         <w:tc>
           <w:tcPr>
-            <w:tcW w:type="dxa" w:w="2778"/>
+            <w:tcW w:type="dxa" w:w="2030"/>
             <w:vAlign w:val="center"/>
             <w:tcMar>
               <w:top w:w="85" w:type="dxa"/>
               <w:bottom w:w="85" w:type="dxa"/>
               <w:left w:w="100" w:type="dxa"/>
               <w:right w:w="100" w:type="dxa"/>
+              <w:top w:w="75" w:type="dxa"/>
+              <w:bottom w:w="75" w:type="dxa"/>
+              <w:left w:w="75" w:type="dxa"/>
+              <w:right w:w="75" w:type="dxa"/>
             </w:tcMar>
+            <w:shd w:fill="FFFFFF"/>
           </w:tcPr>
           <w:p>
             <w:pPr>
               <w:keepNext w:val="0"/>
-              <w:spacing w:after="0" w:line="300" w:lineRule="exact"/>
+              <w:spacing w:after="60" w:line="276" w:lineRule="auto" w:before="0"/>
               <w:ind w:firstLine="0"/>
               <w:jc w:val="left"/>
             </w:pPr>
             <w:r>
               <w:rPr>
+                <w:rFonts w:ascii="Times New Roman" w:hAnsi="Times New Roman" w:eastAsia="宋体"/>
                 <w:b w:val="0"/>
-                <w:sz w:val="20"/>
+                <w:color w:val="000000"/>
+                <w:sz w:val="21"/>
               </w:rPr>
               <w:t>明确的任务要求</w:t>
             </w:r>
@@ -436,26 +545,33 @@
         </w:trPr>
         <w:tc>
           <w:tcPr>
-            <w:tcW w:type="dxa" w:w="1644"/>
+            <w:tcW w:type="dxa" w:w="1944"/>
             <w:vAlign w:val="center"/>
             <w:tcMar>
               <w:top w:w="85" w:type="dxa"/>
               <w:bottom w:w="85" w:type="dxa"/>
               <w:left w:w="100" w:type="dxa"/>
               <w:right w:w="100" w:type="dxa"/>
+              <w:top w:w="75" w:type="dxa"/>
+              <w:bottom w:w="75" w:type="dxa"/>
+              <w:left w:w="75" w:type="dxa"/>
+              <w:right w:w="75" w:type="dxa"/>
             </w:tcMar>
+            <w:shd w:fill="FFFFFF"/>
           </w:tcPr>
           <w:p>
             <w:pPr>
               <w:keepNext w:val="0"/>
-              <w:spacing w:after="0" w:line="300" w:lineRule="exact"/>
+              <w:spacing w:after="60" w:line="276" w:lineRule="auto" w:before="0"/>
               <w:ind w:firstLine="0"/>
-              <w:jc w:val="center"/>
+              <w:jc w:val="left"/>
             </w:pPr>
             <w:r>
               <w:rPr>
+                <w:rFonts w:ascii="Times New Roman" w:hAnsi="Times New Roman" w:eastAsia="宋体"/>
                 <w:b w:val="0"/>
-                <w:sz w:val="20"/>
+                <w:color w:val="000000"/>
+                <w:sz w:val="21"/>
               </w:rPr>
               <w:t>S2 过程监督</w:t>
             </w:r>
@@ -463,26 +579,33 @@
         </w:tc>
         <w:tc>
           <w:tcPr>
-            <w:tcW w:type="dxa" w:w="4535"/>
+            <w:tcW w:type="dxa" w:w="4968"/>
             <w:vAlign w:val="center"/>
             <w:tcMar>
               <w:top w:w="85" w:type="dxa"/>
               <w:bottom w:w="85" w:type="dxa"/>
               <w:left w:w="100" w:type="dxa"/>
               <w:right w:w="100" w:type="dxa"/>
+              <w:top w:w="75" w:type="dxa"/>
+              <w:bottom w:w="75" w:type="dxa"/>
+              <w:left w:w="75" w:type="dxa"/>
+              <w:right w:w="75" w:type="dxa"/>
             </w:tcMar>
+            <w:shd w:fill="FFFFFF"/>
           </w:tcPr>
           <w:p>
             <w:pPr>
               <w:keepNext w:val="0"/>
-              <w:spacing w:after="0" w:line="300" w:lineRule="exact"/>
+              <w:spacing w:after="60" w:line="276" w:lineRule="auto" w:before="0"/>
               <w:ind w:firstLine="0"/>
               <w:jc w:val="left"/>
             </w:pPr>
             <w:r>
               <w:rPr>
+                <w:rFonts w:ascii="Times New Roman" w:hAnsi="Times New Roman" w:eastAsia="宋体"/>
                 <w:b w:val="0"/>
-                <w:sz w:val="20"/>
+                <w:color w:val="000000"/>
+                <w:sz w:val="21"/>
               </w:rPr>
               <w:t>理解执行状态、重要变化与后续安排</w:t>
             </w:r>
@@ -490,26 +613,33 @@
         </w:tc>
         <w:tc>
           <w:tcPr>
-            <w:tcW w:type="dxa" w:w="2778"/>
+            <w:tcW w:type="dxa" w:w="2030"/>
             <w:vAlign w:val="center"/>
             <w:tcMar>
               <w:top w:w="85" w:type="dxa"/>
               <w:bottom w:w="85" w:type="dxa"/>
               <w:left w:w="100" w:type="dxa"/>
               <w:right w:w="100" w:type="dxa"/>
+              <w:top w:w="75" w:type="dxa"/>
+              <w:bottom w:w="75" w:type="dxa"/>
+              <w:left w:w="75" w:type="dxa"/>
+              <w:right w:w="75" w:type="dxa"/>
             </w:tcMar>
+            <w:shd w:fill="FFFFFF"/>
           </w:tcPr>
           <w:p>
             <w:pPr>
               <w:keepNext w:val="0"/>
-              <w:spacing w:after="0" w:line="300" w:lineRule="exact"/>
+              <w:spacing w:after="60" w:line="276" w:lineRule="auto" w:before="0"/>
               <w:ind w:firstLine="0"/>
               <w:jc w:val="left"/>
             </w:pPr>
             <w:r>
               <w:rPr>
+                <w:rFonts w:ascii="Times New Roman" w:hAnsi="Times New Roman" w:eastAsia="宋体"/>
                 <w:b w:val="0"/>
-                <w:sz w:val="20"/>
+                <w:color w:val="000000"/>
+                <w:sz w:val="21"/>
               </w:rPr>
               <w:t>继续观察或准备介入</w:t>
             </w:r>
@@ -522,26 +652,33 @@
         </w:trPr>
         <w:tc>
           <w:tcPr>
-            <w:tcW w:type="dxa" w:w="1644"/>
+            <w:tcW w:type="dxa" w:w="1944"/>
             <w:vAlign w:val="center"/>
             <w:tcMar>
               <w:top w:w="85" w:type="dxa"/>
               <w:bottom w:w="85" w:type="dxa"/>
               <w:left w:w="100" w:type="dxa"/>
               <w:right w:w="100" w:type="dxa"/>
+              <w:top w:w="75" w:type="dxa"/>
+              <w:bottom w:w="75" w:type="dxa"/>
+              <w:left w:w="75" w:type="dxa"/>
+              <w:right w:w="75" w:type="dxa"/>
             </w:tcMar>
+            <w:shd w:fill="FFFFFF"/>
           </w:tcPr>
           <w:p>
             <w:pPr>
               <w:keepNext w:val="0"/>
-              <w:spacing w:after="0" w:line="300" w:lineRule="exact"/>
+              <w:spacing w:after="60" w:line="276" w:lineRule="auto" w:before="0"/>
               <w:ind w:firstLine="0"/>
-              <w:jc w:val="center"/>
+              <w:jc w:val="left"/>
             </w:pPr>
             <w:r>
               <w:rPr>
+                <w:rFonts w:ascii="Times New Roman" w:hAnsi="Times New Roman" w:eastAsia="宋体"/>
                 <w:b w:val="0"/>
-                <w:sz w:val="20"/>
+                <w:color w:val="000000"/>
+                <w:sz w:val="21"/>
               </w:rPr>
               <w:t>S3 必要征询</w:t>
             </w:r>
@@ -549,26 +686,33 @@
         </w:tc>
         <w:tc>
           <w:tcPr>
-            <w:tcW w:type="dxa" w:w="4535"/>
+            <w:tcW w:type="dxa" w:w="4968"/>
             <w:vAlign w:val="center"/>
             <w:tcMar>
               <w:top w:w="85" w:type="dxa"/>
               <w:bottom w:w="85" w:type="dxa"/>
               <w:left w:w="100" w:type="dxa"/>
               <w:right w:w="100" w:type="dxa"/>
+              <w:top w:w="75" w:type="dxa"/>
+              <w:bottom w:w="75" w:type="dxa"/>
+              <w:left w:w="75" w:type="dxa"/>
+              <w:right w:w="75" w:type="dxa"/>
             </w:tcMar>
+            <w:shd w:fill="FFFFFF"/>
           </w:tcPr>
           <w:p>
             <w:pPr>
               <w:keepNext w:val="0"/>
-              <w:spacing w:after="0" w:line="300" w:lineRule="exact"/>
+              <w:spacing w:after="60" w:line="276" w:lineRule="auto" w:before="0"/>
               <w:ind w:firstLine="0"/>
               <w:jc w:val="left"/>
             </w:pPr>
             <w:r>
               <w:rPr>
+                <w:rFonts w:ascii="Times New Roman" w:hAnsi="Times New Roman" w:eastAsia="宋体"/>
                 <w:b w:val="0"/>
-                <w:sz w:val="20"/>
+                <w:color w:val="000000"/>
+                <w:sz w:val="21"/>
               </w:rPr>
               <w:t>理解取舍原因，选择、修改或拒绝安排</w:t>
             </w:r>
@@ -576,26 +720,33 @@
         </w:tc>
         <w:tc>
           <w:tcPr>
-            <w:tcW w:type="dxa" w:w="2778"/>
+            <w:tcW w:type="dxa" w:w="2030"/>
             <w:vAlign w:val="center"/>
             <w:tcMar>
               <w:top w:w="85" w:type="dxa"/>
               <w:bottom w:w="85" w:type="dxa"/>
               <w:left w:w="100" w:type="dxa"/>
               <w:right w:w="100" w:type="dxa"/>
+              <w:top w:w="75" w:type="dxa"/>
+              <w:bottom w:w="75" w:type="dxa"/>
+              <w:left w:w="75" w:type="dxa"/>
+              <w:right w:w="75" w:type="dxa"/>
             </w:tcMar>
+            <w:shd w:fill="FFFFFF"/>
           </w:tcPr>
           <w:p>
             <w:pPr>
               <w:keepNext w:val="0"/>
-              <w:spacing w:after="0" w:line="300" w:lineRule="exact"/>
+              <w:spacing w:after="60" w:line="276" w:lineRule="auto" w:before="0"/>
               <w:ind w:firstLine="0"/>
               <w:jc w:val="left"/>
             </w:pPr>
             <w:r>
               <w:rPr>
+                <w:rFonts w:ascii="Times New Roman" w:hAnsi="Times New Roman" w:eastAsia="宋体"/>
                 <w:b w:val="0"/>
-                <w:sz w:val="20"/>
+                <w:color w:val="000000"/>
+                <w:sz w:val="21"/>
               </w:rPr>
               <w:t>权限内的决定</w:t>
             </w:r>
@@ -608,26 +759,33 @@
         </w:trPr>
         <w:tc>
           <w:tcPr>
-            <w:tcW w:type="dxa" w:w="1644"/>
+            <w:tcW w:type="dxa" w:w="1944"/>
             <w:vAlign w:val="center"/>
             <w:tcMar>
               <w:top w:w="85" w:type="dxa"/>
               <w:bottom w:w="85" w:type="dxa"/>
               <w:left w:w="100" w:type="dxa"/>
               <w:right w:w="100" w:type="dxa"/>
+              <w:top w:w="75" w:type="dxa"/>
+              <w:bottom w:w="75" w:type="dxa"/>
+              <w:left w:w="75" w:type="dxa"/>
+              <w:right w:w="75" w:type="dxa"/>
             </w:tcMar>
+            <w:shd w:fill="FFFFFF"/>
           </w:tcPr>
           <w:p>
             <w:pPr>
               <w:keepNext w:val="0"/>
-              <w:spacing w:after="0" w:line="300" w:lineRule="exact"/>
+              <w:spacing w:after="60" w:line="276" w:lineRule="auto" w:before="0"/>
               <w:ind w:firstLine="0"/>
-              <w:jc w:val="center"/>
+              <w:jc w:val="left"/>
             </w:pPr>
             <w:r>
               <w:rPr>
+                <w:rFonts w:ascii="Times New Roman" w:hAnsi="Times New Roman" w:eastAsia="宋体"/>
                 <w:b w:val="0"/>
-                <w:sz w:val="20"/>
+                <w:color w:val="000000"/>
+                <w:sz w:val="21"/>
               </w:rPr>
               <w:t>S4 主动调整</w:t>
             </w:r>
@@ -635,26 +793,33 @@
         </w:tc>
         <w:tc>
           <w:tcPr>
-            <w:tcW w:type="dxa" w:w="4535"/>
+            <w:tcW w:type="dxa" w:w="4968"/>
             <w:vAlign w:val="center"/>
             <w:tcMar>
               <w:top w:w="85" w:type="dxa"/>
               <w:bottom w:w="85" w:type="dxa"/>
               <w:left w:w="100" w:type="dxa"/>
               <w:right w:w="100" w:type="dxa"/>
+              <w:top w:w="75" w:type="dxa"/>
+              <w:bottom w:w="75" w:type="dxa"/>
+              <w:left w:w="75" w:type="dxa"/>
+              <w:right w:w="75" w:type="dxa"/>
             </w:tcMar>
+            <w:shd w:fill="FFFFFF"/>
           </w:tcPr>
           <w:p>
             <w:pPr>
               <w:keepNext w:val="0"/>
-              <w:spacing w:after="0" w:line="300" w:lineRule="exact"/>
+              <w:spacing w:after="60" w:line="276" w:lineRule="auto" w:before="0"/>
               <w:ind w:firstLine="0"/>
               <w:jc w:val="left"/>
             </w:pPr>
             <w:r>
               <w:rPr>
+                <w:rFonts w:ascii="Times New Roman" w:hAnsi="Times New Roman" w:eastAsia="宋体"/>
                 <w:b w:val="0"/>
-                <w:sz w:val="20"/>
+                <w:color w:val="000000"/>
+                <w:sz w:val="21"/>
               </w:rPr>
               <w:t>指定对象和范围，表达新的任务要求</w:t>
             </w:r>
@@ -662,26 +827,33 @@
         </w:tc>
         <w:tc>
           <w:tcPr>
-            <w:tcW w:type="dxa" w:w="2778"/>
+            <w:tcW w:type="dxa" w:w="2030"/>
             <w:vAlign w:val="center"/>
             <w:tcMar>
               <w:top w:w="85" w:type="dxa"/>
               <w:bottom w:w="85" w:type="dxa"/>
               <w:left w:w="100" w:type="dxa"/>
               <w:right w:w="100" w:type="dxa"/>
+              <w:top w:w="75" w:type="dxa"/>
+              <w:bottom w:w="75" w:type="dxa"/>
+              <w:left w:w="75" w:type="dxa"/>
+              <w:right w:w="75" w:type="dxa"/>
             </w:tcMar>
+            <w:shd w:fill="FFFFFF"/>
           </w:tcPr>
           <w:p>
             <w:pPr>
               <w:keepNext w:val="0"/>
-              <w:spacing w:after="0" w:line="300" w:lineRule="exact"/>
+              <w:spacing w:after="60" w:line="276" w:lineRule="auto" w:before="0"/>
               <w:ind w:firstLine="0"/>
               <w:jc w:val="left"/>
             </w:pPr>
             <w:r>
               <w:rPr>
+                <w:rFonts w:ascii="Times New Roman" w:hAnsi="Times New Roman" w:eastAsia="宋体"/>
                 <w:b w:val="0"/>
-                <w:sz w:val="20"/>
+                <w:color w:val="000000"/>
+                <w:sz w:val="21"/>
               </w:rPr>
               <w:t>明确的调整要求</w:t>
             </w:r>
@@ -694,26 +866,33 @@
         </w:trPr>
         <w:tc>
           <w:tcPr>
-            <w:tcW w:type="dxa" w:w="1644"/>
+            <w:tcW w:type="dxa" w:w="1944"/>
             <w:vAlign w:val="center"/>
             <w:tcMar>
               <w:top w:w="85" w:type="dxa"/>
               <w:bottom w:w="85" w:type="dxa"/>
               <w:left w:w="100" w:type="dxa"/>
               <w:right w:w="100" w:type="dxa"/>
+              <w:top w:w="75" w:type="dxa"/>
+              <w:bottom w:w="75" w:type="dxa"/>
+              <w:left w:w="75" w:type="dxa"/>
+              <w:right w:w="75" w:type="dxa"/>
             </w:tcMar>
+            <w:shd w:fill="FFFFFF"/>
           </w:tcPr>
           <w:p>
             <w:pPr>
               <w:keepNext w:val="0"/>
-              <w:spacing w:after="0" w:line="300" w:lineRule="exact"/>
+              <w:spacing w:after="60" w:line="276" w:lineRule="auto" w:before="0"/>
               <w:ind w:firstLine="0"/>
-              <w:jc w:val="center"/>
+              <w:jc w:val="left"/>
             </w:pPr>
             <w:r>
               <w:rPr>
+                <w:rFonts w:ascii="Times New Roman" w:hAnsi="Times New Roman" w:eastAsia="宋体"/>
                 <w:b w:val="0"/>
-                <w:sz w:val="20"/>
+                <w:color w:val="000000"/>
+                <w:sz w:val="21"/>
               </w:rPr>
               <w:t>S5 异常恢复</w:t>
             </w:r>
@@ -721,26 +900,33 @@
         </w:tc>
         <w:tc>
           <w:tcPr>
-            <w:tcW w:type="dxa" w:w="4535"/>
+            <w:tcW w:type="dxa" w:w="4968"/>
             <w:vAlign w:val="center"/>
             <w:tcMar>
               <w:top w:w="85" w:type="dxa"/>
               <w:bottom w:w="85" w:type="dxa"/>
               <w:left w:w="100" w:type="dxa"/>
               <w:right w:w="100" w:type="dxa"/>
+              <w:top w:w="75" w:type="dxa"/>
+              <w:bottom w:w="75" w:type="dxa"/>
+              <w:left w:w="75" w:type="dxa"/>
+              <w:right w:w="75" w:type="dxa"/>
             </w:tcMar>
+            <w:shd w:fill="FFFFFF"/>
           </w:tcPr>
           <w:p>
             <w:pPr>
               <w:keepNext w:val="0"/>
-              <w:spacing w:after="0" w:line="300" w:lineRule="exact"/>
+              <w:spacing w:after="60" w:line="276" w:lineRule="auto" w:before="0"/>
               <w:ind w:firstLine="0"/>
               <w:jc w:val="left"/>
             </w:pPr>
             <w:r>
               <w:rPr>
+                <w:rFonts w:ascii="Times New Roman" w:hAnsi="Times New Roman" w:eastAsia="宋体"/>
                 <w:b w:val="0"/>
-                <w:sz w:val="20"/>
+                <w:color w:val="000000"/>
+                <w:sz w:val="21"/>
               </w:rPr>
               <w:t>理解异常及自主处理，判断是否需要进一步调整</w:t>
             </w:r>
@@ -748,26 +934,33 @@
         </w:tc>
         <w:tc>
           <w:tcPr>
-            <w:tcW w:type="dxa" w:w="2778"/>
+            <w:tcW w:type="dxa" w:w="2030"/>
             <w:vAlign w:val="center"/>
             <w:tcMar>
               <w:top w:w="85" w:type="dxa"/>
               <w:bottom w:w="85" w:type="dxa"/>
               <w:left w:w="100" w:type="dxa"/>
               <w:right w:w="100" w:type="dxa"/>
+              <w:top w:w="75" w:type="dxa"/>
+              <w:bottom w:w="75" w:type="dxa"/>
+              <w:left w:w="75" w:type="dxa"/>
+              <w:right w:w="75" w:type="dxa"/>
             </w:tcMar>
+            <w:shd w:fill="FFFFFF"/>
           </w:tcPr>
           <w:p>
             <w:pPr>
               <w:keepNext w:val="0"/>
-              <w:spacing w:after="0" w:line="300" w:lineRule="exact"/>
+              <w:spacing w:after="60" w:line="276" w:lineRule="auto" w:before="0"/>
               <w:ind w:firstLine="0"/>
               <w:jc w:val="left"/>
             </w:pPr>
             <w:r>
               <w:rPr>
+                <w:rFonts w:ascii="Times New Roman" w:hAnsi="Times New Roman" w:eastAsia="宋体"/>
                 <w:b w:val="0"/>
-                <w:sz w:val="20"/>
+                <w:color w:val="000000"/>
+                <w:sz w:val="21"/>
               </w:rPr>
               <w:t>后续处理或继续执行</w:t>
             </w:r>
@@ -780,26 +973,33 @@
         </w:trPr>
         <w:tc>
           <w:tcPr>
-            <w:tcW w:type="dxa" w:w="1644"/>
+            <w:tcW w:type="dxa" w:w="1944"/>
             <w:vAlign w:val="center"/>
             <w:tcMar>
               <w:top w:w="85" w:type="dxa"/>
               <w:bottom w:w="85" w:type="dxa"/>
               <w:left w:w="100" w:type="dxa"/>
               <w:right w:w="100" w:type="dxa"/>
+              <w:top w:w="75" w:type="dxa"/>
+              <w:bottom w:w="75" w:type="dxa"/>
+              <w:left w:w="75" w:type="dxa"/>
+              <w:right w:w="75" w:type="dxa"/>
             </w:tcMar>
+            <w:shd w:fill="FFFFFF"/>
           </w:tcPr>
           <w:p>
             <w:pPr>
               <w:keepNext w:val="0"/>
-              <w:spacing w:after="0" w:line="300" w:lineRule="exact"/>
+              <w:spacing w:after="60" w:line="276" w:lineRule="auto" w:before="0"/>
               <w:ind w:firstLine="0"/>
-              <w:jc w:val="center"/>
+              <w:jc w:val="left"/>
             </w:pPr>
             <w:r>
               <w:rPr>
+                <w:rFonts w:ascii="Times New Roman" w:hAnsi="Times New Roman" w:eastAsia="宋体"/>
                 <w:b w:val="0"/>
-                <w:sz w:val="20"/>
+                <w:color w:val="000000"/>
+                <w:sz w:val="21"/>
               </w:rPr>
               <w:t>S6 结果确认</w:t>
             </w:r>
@@ -807,26 +1007,33 @@
         </w:tc>
         <w:tc>
           <w:tcPr>
-            <w:tcW w:type="dxa" w:w="4535"/>
+            <w:tcW w:type="dxa" w:w="4968"/>
             <w:vAlign w:val="center"/>
             <w:tcMar>
               <w:top w:w="85" w:type="dxa"/>
               <w:bottom w:w="85" w:type="dxa"/>
               <w:left w:w="100" w:type="dxa"/>
               <w:right w:w="100" w:type="dxa"/>
+              <w:top w:w="75" w:type="dxa"/>
+              <w:bottom w:w="75" w:type="dxa"/>
+              <w:left w:w="75" w:type="dxa"/>
+              <w:right w:w="75" w:type="dxa"/>
             </w:tcMar>
+            <w:shd w:fill="FFFFFF"/>
           </w:tcPr>
           <w:p>
             <w:pPr>
               <w:keepNext w:val="0"/>
-              <w:spacing w:after="0" w:line="300" w:lineRule="exact"/>
+              <w:spacing w:after="60" w:line="276" w:lineRule="auto" w:before="0"/>
               <w:ind w:firstLine="0"/>
               <w:jc w:val="left"/>
             </w:pPr>
             <w:r>
               <w:rPr>
+                <w:rFonts w:ascii="Times New Roman" w:hAnsi="Times New Roman" w:eastAsia="宋体"/>
                 <w:b w:val="0"/>
-                <w:sz w:val="20"/>
+                <w:color w:val="000000"/>
+                <w:sz w:val="21"/>
               </w:rPr>
               <w:t>对照目标检查完成情况与未完成项</w:t>
             </w:r>
@@ -834,26 +1041,33 @@
         </w:tc>
         <w:tc>
           <w:tcPr>
-            <w:tcW w:type="dxa" w:w="2778"/>
+            <w:tcW w:type="dxa" w:w="2030"/>
             <w:vAlign w:val="center"/>
             <w:tcMar>
               <w:top w:w="85" w:type="dxa"/>
               <w:bottom w:w="85" w:type="dxa"/>
               <w:left w:w="100" w:type="dxa"/>
               <w:right w:w="100" w:type="dxa"/>
+              <w:top w:w="75" w:type="dxa"/>
+              <w:bottom w:w="75" w:type="dxa"/>
+              <w:left w:w="75" w:type="dxa"/>
+              <w:right w:w="75" w:type="dxa"/>
             </w:tcMar>
+            <w:shd w:fill="FFFFFF"/>
           </w:tcPr>
           <w:p>
             <w:pPr>
               <w:keepNext w:val="0"/>
-              <w:spacing w:after="0" w:line="300" w:lineRule="exact"/>
+              <w:spacing w:after="60" w:line="276" w:lineRule="auto" w:before="0"/>
               <w:ind w:firstLine="0"/>
               <w:jc w:val="left"/>
             </w:pPr>
             <w:r>
               <w:rPr>
+                <w:rFonts w:ascii="Times New Roman" w:hAnsi="Times New Roman" w:eastAsia="宋体"/>
                 <w:b w:val="0"/>
-                <w:sz w:val="20"/>
+                <w:color w:val="000000"/>
+                <w:sz w:val="21"/>
               </w:rPr>
               <w:t>确认结果或继续任务</w:t>
             </w:r>
@@ -871,6 +1085,9 @@
         <w:pStyle w:val="Heading2"/>
       </w:pPr>
       <w:r>
+        <w:rPr>
+          <w:color w:val="000000"/>
+        </w:rPr>
         <w:t>3.4 重点场景中的交互问题</w:t>
       </w:r>
     </w:p>
@@ -879,6 +1096,9 @@
         <w:pStyle w:val="Heading3"/>
       </w:pPr>
       <w:r>
+        <w:rPr>
+          <w:color w:val="000000"/>
+        </w:rPr>
         <w:t>3.4.1 正常执行与过程监督</w:t>
       </w:r>
     </w:p>
@@ -887,7 +1107,7 @@
         <w:jc w:val="both"/>
       </w:pPr>
       <w:r>
-        <w:t>以持续区域巡查为例，操作员首先需要了解各区域的任务进度、执行设备和后续安排。查看某一区域时，应能判断已完成哪些工作、当前由谁执行以及下一步计划是什么；查看某一设备时，应能定位其所属任务与作用范围。对于按预期完成的自主转移或接替，用户可以继续观察，无须为了结束提示而作出业务确认。该场景用于检查常态理解和查询成本，避免界面只在异常发生后才提供完整上下文。</w:t>
+        <w:t>以持续区域巡查为例，智能体接收目标后，可能先解释任务范围、给出计划，再调用相关能力并持续报告执行情况。用户首先需要判断理解和计划是否符合要求；执行中则关注区域进展、执行对象、重要变化与后续安排。界面应把这些信息与对应任务和地图对象联系起来，使用户既能把握整体，也能按需查看工具结果等依据。该场景用于检查多类输出的组织是否支持正常理解，而非仅检验异常提示是否醒目。</w:t>
       </w:r>
     </w:p>
     <w:p>
@@ -895,6 +1115,9 @@
         <w:pStyle w:val="Heading3"/>
       </w:pPr>
       <w:r>
+        <w:rPr>
+          <w:color w:val="000000"/>
+        </w:rPr>
         <w:t>3.4.2 执行中新增区域</w:t>
       </w:r>
     </w:p>
@@ -911,7 +1134,7 @@
         <w:jc w:val="both"/>
       </w:pPr>
       <w:r>
-        <w:t>此场景的需求假设在于，空间选区与要求表达之间可能存在信息衔接问题：所选范围是否被正确使用，原任务的哪些要求继续保留，新增工作何时进入执行。交互应支持用户在提交前修正误解，并在提交后沿同一区域或任务核查结果。若后台只提供计划变化而缺少完成时间估计，界面应依据实际可得信息说明变化，不补造量化影响。</w:t>
+        <w:t>此场景需要衔接空间选区、要求解释和后续核查：用户应能检查所选范围、保留的原要求及新增工作的生效条件，并修正智能体对要求的误解。若要求与原约束冲突或存在缺项，系统应提出具体澄清，不能静默删除原要求。提交后，用户沿相同区域或任务核查计划变化及执行依据；后台缺少完成时间估计时，界面只说明可获得的变化与影响。</w:t>
       </w:r>
     </w:p>
     <w:p>
@@ -919,6 +1142,9 @@
         <w:pStyle w:val="Heading3"/>
       </w:pPr>
       <w:r>
+        <w:rPr>
+          <w:color w:val="000000"/>
+        </w:rPr>
         <w:t>3.4.3 设备异常与自主接替</w:t>
       </w:r>
     </w:p>
@@ -927,7 +1153,7 @@
         <w:jc w:val="both"/>
       </w:pPr>
       <w:r>
-        <w:t>某设备无法继续承担任务后，系统自主将剩余工作交由其他设备执行。操作员需要理解接替涉及哪些任务和区域，原设备已经完成的工作是否保留，后续路径与任务顺序发生了什么变化，以及这些变化是否影响原目标。研究重点是用户如何理解并判断自主调整后的任务状态，而具体接替方案由既有系统产生。</w:t>
+        <w:t>某设备被确认无法继续承担任务，或既有业务规则因异常触发接替后，系统自主调整相关工作归属。操作员需要理解接替依据、涉及的任务和区域、已确认完成工作的保留情况，以及后续路径与任务顺序的变化。若触发事件是失联，最后报告只能说明对应时刻的状态，不能证明设备已经停止或此后的工作未完成。具体接替方案由既有系统产生，界面应分别呈现接替安排、原设备的未知部分及新执行端的反馈。</w:t>
       </w:r>
     </w:p>
     <w:p>
@@ -935,7 +1161,7 @@
         <w:jc w:val="both"/>
       </w:pPr>
       <w:r>
-        <w:t>若调整符合既有要求，合理行为可以是继续观察；若出现任务遗漏、范围变化或不符合约束的安排，操作员可在权限内否决或改派。只有用户确实需要比较可行调整时，界面才呈现对应的任务范围、变化部分和可获得的影响信息。评价应同时包含无需进一步介入和需要介入的情形，以区分准确监督与无必要的重复调整。异常后的信息缺失也应与已确认的执行变化分开表达。</w:t>
+        <w:t>若接替符合既有要求，合理行为可以是继续观察；若出现任务遗漏、范围变化或不符合约束的安排，操作员可在权限内否决或改派。判断所需信息包括触发原因、原与新任务分配、受影响对象、保留约束以及尚未获得的执行依据。评价应同时包含无需介入和需要介入的情形，依据事先核定的可接受操作判断，区分准确监督、漏介入和无必要的重复调整。</w:t>
       </w:r>
     </w:p>
     <w:p>
@@ -943,6 +1169,9 @@
         <w:pStyle w:val="Heading2"/>
       </w:pPr>
       <w:r>
+        <w:rPr>
+          <w:color w:val="000000"/>
+        </w:rPr>
         <w:t>3.5 用户交互需求</w:t>
       </w:r>
     </w:p>
@@ -951,7 +1180,7 @@
         <w:jc w:val="both"/>
       </w:pPr>
       <w:r>
-        <w:t>根据上述任务特征和场景推演，本文提出五项交互需求。它们描述用户需要完成的工作和判断条件，作为后续设计与业务走查的依据；具体困难的发生频率、严重程度及现有界面的支持情况仍需核查。</w:t>
+        <w:t>根据上述任务特征与场景推演，本文提出五项交互需求，分别对应用户需要完成的判断与操作。每项需求记录其情境、所需信息、允许操作和结果判断条件，作为业务走查与后续设计的依据。班组形态和职责来自当前业务描述，具体困难的发生频率、严重程度及现有支持程度仍待核查。</w:t>
       </w:r>
     </w:p>
     <w:p>
@@ -959,6 +1188,9 @@
         <w:pStyle w:val="Heading3"/>
       </w:pPr>
       <w:r>
+        <w:rPr>
+          <w:color w:val="000000"/>
+        </w:rPr>
         <w:t>3.5.1 任务进展与空间分布理解</w:t>
       </w:r>
     </w:p>
@@ -975,6 +1207,9 @@
         <w:pStyle w:val="Heading3"/>
       </w:pPr>
       <w:r>
+        <w:rPr>
+          <w:color w:val="000000"/>
+        </w:rPr>
         <w:t>3.5.2 变化过程与后续安排理解</w:t>
       </w:r>
     </w:p>
@@ -982,8 +1217,15 @@
       <w:pPr>
         <w:jc w:val="both"/>
       </w:pPr>
+      <w:commentRangeStart w:id="1"/>
       <w:r>
-        <w:t>R2要求用户能够理解关键变化及其与当前状态、后续安排的关系。用户应能分辨变化前后的工作范围和执行归属，并在需要时找到相应历史依据。信息呈现需区分已经发生的事实、当前有效的计划和对未来的估计，历史查看需标明时间参照。评价重点是变化遗漏、过程理解和后续影响判断，而非用户记住全部事件的数量。</w:t>
+        <w:t>R2要求用户理解关键变化及其与目标、当前执行和后续安排的关系。信息应说明发生了什么、为什么变化、影响哪些任务或空间对象，以及还有哪些未知。摘要突出当前判断所需内容，详情保留来源与时间；最后报告不能直接代表当前状态，计划也不等于已经执行。评价检查变化原因、影响对象和未知信息的理解，同时记录重要变化遗漏与阅读负担。</w:t>
+      </w:r>
+      <w:commentRangeEnd w:id="1"/>
+      <w:r>
+        <w:rPr>
+          <w:rStyle w:val="CommentReference"/>
+        </w:rPr>
       </w:r>
     </w:p>
     <w:p>
@@ -991,6 +1233,9 @@
         <w:pStyle w:val="Heading3"/>
       </w:pPr>
       <w:r>
+        <w:rPr>
+          <w:color w:val="000000"/>
+        </w:rPr>
         <w:t>3.5.3 空间调整的准确表达</w:t>
       </w:r>
     </w:p>
@@ -999,7 +1244,7 @@
         <w:jc w:val="both"/>
       </w:pPr>
       <w:r>
-        <w:t>R3要求用户能够明确指定调整对象、空间范围、任务要求与生效条件。空间选择、对象输入和语言描述之间应保持对应，提交前应能检查并修正系统理解。例如，调整某区域的任务时，用户应能区分对区域内全部工作、某类工作或指定设备的修改。该需求通过对象、范围、约束和时间条件的表达错误及操作完成情况检验。</w:t>
+        <w:t>R3要求用户能够在执行过程中准确表达新的目标或约束，明确修改对象、空间范围和生效条件。地图选择、结构化输入和自然语言可组合使用，用户应能检查并修正智能体的理解；要求不完整时，系统提出具体澄清。评价核查对象、范围、约束及时间条件，并记录从表达要求到形成可确认决定的操作成本。</w:t>
       </w:r>
     </w:p>
     <w:p>
@@ -1007,6 +1252,9 @@
         <w:pStyle w:val="Heading3"/>
       </w:pPr>
       <w:r>
+        <w:rPr>
+          <w:color w:val="000000"/>
+        </w:rPr>
         <w:t>3.5.4 影响理解与介入判断</w:t>
       </w:r>
     </w:p>
@@ -1023,6 +1271,9 @@
         <w:pStyle w:val="Heading3"/>
       </w:pPr>
       <w:r>
+        <w:rPr>
+          <w:color w:val="000000"/>
+        </w:rPr>
         <w:t>3.5.5 执行反馈与后续衔接</w:t>
       </w:r>
     </w:p>
@@ -1031,7 +1282,7 @@
         <w:jc w:val="both"/>
       </w:pPr>
       <w:r>
-        <w:t>R5要求用户能够对照已确认要求核查执行反馈，并识别尚未完成或需要再次处理的部分。请求被接收、计划被更新和实际目标达成具有不同含义，应按可获得的业务依据加以区分。多对象调整需保留各对象的落实情况，连续修改产生的反馈应能归属到相应要求。评价时分别记录执行事实与用户判断，以识别错误确认、重复提交或不恰当的后续操作。</w:t>
+        <w:t>R5要求用户能够把后续反馈与已确认要求联系起来，判断调整和任务结果。界面需要区分要求已接收、计划已更新与实际执行结果；涉及多个对象时，允许呈现部分落实或尚待确认。反馈还应说明下一步由谁处理，以及是否需要再次参与。评价分别记录实际执行和用户判断，检查错误确认、重复提交与不恰当的后续操作。</w:t>
       </w:r>
     </w:p>
     <w:p>
@@ -1039,7 +1290,52 @@
         <w:pStyle w:val="Heading2"/>
       </w:pPr>
       <w:r>
-        <w:t>3.6 需求与机制设计的对应</w:t>
+        <w:rPr>
+          <w:color w:val="000000"/>
+        </w:rPr>
+        <w:t>3.6 人与智能体的交互总体框架</w:t>
+      </w:r>
+    </w:p>
+    <w:p>
+      <w:pPr/>
+      <w:commentRangeStart w:id="2"/>
+      <w:r>
+        <w:t>本文将人与智能体的交互组织为三项相互衔接的机制。M1执行信息组织与呈现，将理解确认、计划、工具结果、进度、变化、异常和最终结果等输出组织为用户能够理解的任务过程，突出当前重点并保留必要详情。M2协同介入，支持用户主动提出调整以及智能体发起征询，通过表达、澄清和确认形成明确决定。M3执行衔接与反馈，将后续执行和结果对应到任务目标及已确认要求，支持用户核查并继续参与。</w:t>
+      </w:r>
+      <w:commentRangeEnd w:id="2"/>
+      <w:r>
+        <w:rPr>
+          <w:rStyle w:val="CommentReference"/>
+        </w:rPr>
+      </w:r>
+    </w:p>
+    <w:p>
+      <w:pPr/>
+      <w:r>
+        <w:t>三项机制围绕同一任务衔接。用户选择的区域、提出的目标和约束进入计划解释；确认后的要求成为后续执行及结果核查的参照。用户查看过程、提出调整和检查反馈时，应保持任务与空间对象的对应。这里只规定交互中需要保留的关系，具体数据标识、事件映射和迟到反馈处理在实现章节说明。</w:t>
+      </w:r>
+    </w:p>
+    <w:p>
+      <w:pPr/>
+      <w:r>
+        <w:t>以新增区域为例，用户可在地图上选择区域并提出“加入巡查，保留原重点区域要求”。M1提供当前任务和进展，M2让用户检查智能体对新增要求的解释及其对原计划的影响，并在需要时补充或修订；确认后，M3呈现调整是否落实及其后续结果。更新后的任务状态再进入M1，供用户继续监督。该流程将过程输出与用户操作连接起来，具体界面形式将在机制设计与原型中比较。</w:t>
+      </w:r>
+    </w:p>
+    <w:p>
+      <w:pPr/>
+      <w:r>
+        <w:t>正常执行时，用户可以通过M1理解过程，无须逐条确认智能体输出。需要决策时再进入M2，阶段或任务结束时通过M3核查结果。过程信息、待处理事项和结果记录具有不同作用，界面应让用户分清什么需要了解、什么需要行动、什么已经结束。既有地图与任务控件可以与智能体交互共存，具体布局和提醒方式由任务需要与原型评价确定。</w:t>
+      </w:r>
+    </w:p>
+    <w:p>
+      <w:pPr>
+        <w:pStyle w:val="Heading2"/>
+      </w:pPr>
+      <w:r>
+        <w:rPr>
+          <w:color w:val="000000"/>
+        </w:rPr>
+        <w:t>3.7 需求与机制及评价的对应</w:t>
       </w:r>
     </w:p>
     <w:p>
@@ -1047,7 +1343,7 @@
         <w:jc w:val="both"/>
       </w:pPr>
       <w:r>
-        <w:t>五项需求由三项相互衔接的机制承担，如表2所示。执行信息组织与呈现机制M1支持过程理解，协同介入机制M2将理解与调整表达连接起来，执行衔接与反馈机制M3支持结果核查并更新后续理解。空间对象及其任务关联贯穿这一过程，具体控件和布局将在机制设计与原型阶段确定。</w:t>
+        <w:t>表2将五项需求与协作情境、机制及评价问题对应。EQ1侧重理解正确性，EQ2侧重表达、介入和落实判断；R4同时涉及理解影响与决定是否行动。S1—S6用于检查协作过程覆盖，成功、部分落实、失败和未知等用于检查结果状态覆盖，两者分别记录。正常监督、新增区域和自主接替采用共用机制，不因业务事件不同而建立独立框架。</w:t>
       </w:r>
     </w:p>
     <w:p>
@@ -1062,7 +1358,7 @@
         <w:rPr>
           <w:sz w:val="21"/>
         </w:rPr>
-        <w:t>表2 需求与机制及评价的对应</w:t>
+        <w:t>表2 需求与情境及评价的对应</w:t>
       </w:r>
     </w:p>
     <w:tbl>
@@ -1081,38 +1377,40 @@
         </w:tblBorders>
       </w:tblPr>
       <w:tblGrid>
-        <w:gridCol w:w="1871"/>
-        <w:gridCol w:w="2835"/>
-        <w:gridCol w:w="4252"/>
+        <w:gridCol w:w="1310"/>
+        <w:gridCol w:w="1238"/>
+        <w:gridCol w:w="1036"/>
+        <w:gridCol w:w="1036"/>
+        <w:gridCol w:w="4320"/>
       </w:tblGrid>
       <w:tr>
         <w:trPr>
-          <w:cantSplit/>
           <w:tblHeader/>
         </w:trPr>
         <w:tc>
           <w:tcPr>
-            <w:tcW w:type="dxa" w:w="1871"/>
+            <w:tcW w:type="dxa" w:w="1310"/>
             <w:vAlign w:val="center"/>
             <w:tcMar>
-              <w:top w:w="85" w:type="dxa"/>
-              <w:bottom w:w="85" w:type="dxa"/>
-              <w:left w:w="100" w:type="dxa"/>
-              <w:right w:w="100" w:type="dxa"/>
+              <w:top w:w="75" w:type="dxa"/>
+              <w:bottom w:w="75" w:type="dxa"/>
+              <w:left w:w="75" w:type="dxa"/>
+              <w:right w:w="75" w:type="dxa"/>
             </w:tcMar>
             <w:shd w:fill="E8EDF2"/>
           </w:tcPr>
           <w:p>
             <w:pPr>
-              <w:keepNext/>
-              <w:spacing w:after="0" w:line="300" w:lineRule="exact"/>
+              <w:spacing w:before="0" w:after="60" w:line="276" w:lineRule="auto"/>
               <w:ind w:firstLine="0"/>
               <w:jc w:val="center"/>
             </w:pPr>
             <w:r>
               <w:rPr>
+                <w:rFonts w:ascii="Times New Roman" w:hAnsi="Times New Roman" w:eastAsia="宋体"/>
                 <w:b/>
-                <w:sz w:val="20"/>
+                <w:color w:val="000000"/>
+                <w:sz w:val="21"/>
               </w:rPr>
               <w:t>需求</w:t>
             </w:r>
@@ -1120,87 +1418,147 @@
         </w:tc>
         <w:tc>
           <w:tcPr>
-            <w:tcW w:type="dxa" w:w="2835"/>
+            <w:tcW w:type="dxa" w:w="1238"/>
             <w:vAlign w:val="center"/>
             <w:tcMar>
-              <w:top w:w="85" w:type="dxa"/>
-              <w:bottom w:w="85" w:type="dxa"/>
-              <w:left w:w="100" w:type="dxa"/>
-              <w:right w:w="100" w:type="dxa"/>
+              <w:top w:w="75" w:type="dxa"/>
+              <w:bottom w:w="75" w:type="dxa"/>
+              <w:left w:w="75" w:type="dxa"/>
+              <w:right w:w="75" w:type="dxa"/>
             </w:tcMar>
             <w:shd w:fill="E8EDF2"/>
           </w:tcPr>
           <w:p>
             <w:pPr>
-              <w:keepNext/>
-              <w:spacing w:after="0" w:line="300" w:lineRule="exact"/>
+              <w:spacing w:before="0" w:after="60" w:line="276" w:lineRule="auto"/>
+              <w:ind w:firstLine="0"/>
+              <w:jc w:val="center"/>
+            </w:pPr>
+            <w:r>
+              <w:rPr>
+                <w:rFonts w:ascii="Times New Roman" w:hAnsi="Times New Roman" w:eastAsia="宋体"/>
+                <w:b/>
+                <w:color w:val="000000"/>
+                <w:sz w:val="21"/>
+              </w:rPr>
+              <w:t>重点情境</w:t>
+            </w:r>
+          </w:p>
+        </w:tc>
+        <w:tc>
+          <w:tcPr>
+            <w:tcW w:type="dxa" w:w="1037"/>
+            <w:vAlign w:val="center"/>
+            <w:tcMar>
+              <w:top w:w="75" w:type="dxa"/>
+              <w:bottom w:w="75" w:type="dxa"/>
+              <w:left w:w="75" w:type="dxa"/>
+              <w:right w:w="75" w:type="dxa"/>
+            </w:tcMar>
+            <w:shd w:fill="E8EDF2"/>
+          </w:tcPr>
+          <w:p>
+            <w:pPr>
+              <w:spacing w:before="0" w:after="60" w:line="276" w:lineRule="auto"/>
+              <w:ind w:firstLine="0"/>
+              <w:jc w:val="center"/>
+            </w:pPr>
+            <w:r>
+              <w:rPr>
+                <w:rFonts w:ascii="Times New Roman" w:hAnsi="Times New Roman" w:eastAsia="宋体"/>
+                <w:b/>
+                <w:color w:val="000000"/>
+                <w:sz w:val="21"/>
+              </w:rPr>
+              <w:t>机制</w:t>
+            </w:r>
+          </w:p>
+        </w:tc>
+        <w:tc>
+          <w:tcPr>
+            <w:tcW w:type="dxa" w:w="1037"/>
+            <w:vAlign w:val="center"/>
+            <w:tcMar>
+              <w:top w:w="75" w:type="dxa"/>
+              <w:bottom w:w="75" w:type="dxa"/>
+              <w:left w:w="75" w:type="dxa"/>
+              <w:right w:w="75" w:type="dxa"/>
+            </w:tcMar>
+            <w:shd w:fill="E8EDF2"/>
+          </w:tcPr>
+          <w:p>
+            <w:pPr>
+              <w:spacing w:before="0" w:after="60" w:line="276" w:lineRule="auto"/>
+              <w:ind w:firstLine="0"/>
+              <w:jc w:val="center"/>
+            </w:pPr>
+            <w:r>
+              <w:rPr>
+                <w:rFonts w:ascii="Times New Roman" w:hAnsi="Times New Roman" w:eastAsia="宋体"/>
+                <w:b/>
+                <w:color w:val="000000"/>
+                <w:sz w:val="21"/>
+              </w:rPr>
+              <w:t>评价</w:t>
+            </w:r>
+          </w:p>
+        </w:tc>
+        <w:tc>
+          <w:tcPr>
+            <w:tcW w:type="dxa" w:w="4320"/>
+            <w:vAlign w:val="center"/>
+            <w:tcMar>
+              <w:top w:w="75" w:type="dxa"/>
+              <w:bottom w:w="75" w:type="dxa"/>
+              <w:left w:w="75" w:type="dxa"/>
+              <w:right w:w="75" w:type="dxa"/>
+            </w:tcMar>
+            <w:shd w:fill="E8EDF2"/>
+          </w:tcPr>
+          <w:p>
+            <w:pPr>
+              <w:spacing w:before="0" w:after="60" w:line="276" w:lineRule="auto"/>
+              <w:ind w:firstLine="0"/>
+              <w:jc w:val="center"/>
+            </w:pPr>
+            <w:r>
+              <w:rPr>
+                <w:rFonts w:ascii="Times New Roman" w:hAnsi="Times New Roman" w:eastAsia="宋体"/>
+                <w:b/>
+                <w:color w:val="000000"/>
+                <w:sz w:val="21"/>
+              </w:rPr>
+              <w:t>主要判断与操作</w:t>
+            </w:r>
+          </w:p>
+        </w:tc>
+      </w:tr>
+      <w:tr>
+        <w:trPr/>
+        <w:tc>
+          <w:tcPr>
+            <w:tcW w:type="dxa" w:w="1310"/>
+            <w:vAlign w:val="center"/>
+            <w:tcMar>
+              <w:top w:w="75" w:type="dxa"/>
+              <w:bottom w:w="75" w:type="dxa"/>
+              <w:left w:w="75" w:type="dxa"/>
+              <w:right w:w="75" w:type="dxa"/>
+            </w:tcMar>
+            <w:shd w:fill="FFFFFF"/>
+          </w:tcPr>
+          <w:p>
+            <w:pPr>
+              <w:spacing w:before="0" w:after="60" w:line="276" w:lineRule="auto"/>
               <w:ind w:firstLine="0"/>
               <w:jc w:val="left"/>
             </w:pPr>
             <w:r>
               <w:rPr>
-                <w:b/>
-                <w:sz w:val="20"/>
-              </w:rPr>
-              <w:t>主要机制</w:t>
-            </w:r>
-          </w:p>
-        </w:tc>
-        <w:tc>
-          <w:tcPr>
-            <w:tcW w:type="dxa" w:w="4252"/>
-            <w:vAlign w:val="center"/>
-            <w:tcMar>
-              <w:top w:w="85" w:type="dxa"/>
-              <w:bottom w:w="85" w:type="dxa"/>
-              <w:left w:w="100" w:type="dxa"/>
-              <w:right w:w="100" w:type="dxa"/>
-            </w:tcMar>
-            <w:shd w:fill="E8EDF2"/>
-          </w:tcPr>
-          <w:p>
-            <w:pPr>
-              <w:keepNext/>
-              <w:spacing w:after="0" w:line="300" w:lineRule="exact"/>
-              <w:ind w:firstLine="0"/>
-              <w:jc w:val="left"/>
-            </w:pPr>
-            <w:r>
-              <w:rPr>
-                <w:b/>
-                <w:sz w:val="20"/>
-              </w:rPr>
-              <w:t>拟观察的表现</w:t>
-            </w:r>
-          </w:p>
-        </w:tc>
-      </w:tr>
-      <w:tr>
-        <w:trPr>
-          <w:cantSplit/>
-        </w:trPr>
-        <w:tc>
-          <w:tcPr>
-            <w:tcW w:type="dxa" w:w="1871"/>
-            <w:vAlign w:val="center"/>
-            <w:tcMar>
-              <w:top w:w="85" w:type="dxa"/>
-              <w:bottom w:w="85" w:type="dxa"/>
-              <w:left w:w="100" w:type="dxa"/>
-              <w:right w:w="100" w:type="dxa"/>
-            </w:tcMar>
-          </w:tcPr>
-          <w:p>
-            <w:pPr>
-              <w:keepNext w:val="0"/>
-              <w:spacing w:after="0" w:line="300" w:lineRule="exact"/>
-              <w:ind w:firstLine="0"/>
-              <w:jc w:val="center"/>
-            </w:pPr>
-            <w:r>
-              <w:rPr>
+                <w:rFonts w:ascii="Times New Roman" w:hAnsi="Times New Roman" w:eastAsia="宋体"/>
                 <w:b w:val="0"/>
-                <w:sz w:val="20"/>
+                <w:color w:val="000000"/>
+                <w:sz w:val="21"/>
               </w:rPr>
               <w:t>R1 进展与分布</w:t>
             </w:r>
@@ -1208,85 +1566,147 @@
         </w:tc>
         <w:tc>
           <w:tcPr>
-            <w:tcW w:type="dxa" w:w="2835"/>
+            <w:tcW w:type="dxa" w:w="1238"/>
             <w:vAlign w:val="center"/>
             <w:tcMar>
-              <w:top w:w="85" w:type="dxa"/>
-              <w:bottom w:w="85" w:type="dxa"/>
-              <w:left w:w="100" w:type="dxa"/>
-              <w:right w:w="100" w:type="dxa"/>
+              <w:top w:w="75" w:type="dxa"/>
+              <w:bottom w:w="75" w:type="dxa"/>
+              <w:left w:w="75" w:type="dxa"/>
+              <w:right w:w="75" w:type="dxa"/>
             </w:tcMar>
+            <w:shd w:fill="FFFFFF"/>
           </w:tcPr>
           <w:p>
             <w:pPr>
-              <w:keepNext w:val="0"/>
-              <w:spacing w:after="0" w:line="300" w:lineRule="exact"/>
+              <w:spacing w:before="0" w:after="60" w:line="276" w:lineRule="auto"/>
+              <w:ind w:firstLine="0"/>
+              <w:jc w:val="center"/>
+            </w:pPr>
+            <w:r>
+              <w:rPr>
+                <w:rFonts w:ascii="Times New Roman" w:hAnsi="Times New Roman" w:eastAsia="宋体"/>
+                <w:b w:val="0"/>
+                <w:color w:val="000000"/>
+                <w:sz w:val="21"/>
+              </w:rPr>
+              <w:t>S1、S2</w:t>
+            </w:r>
+          </w:p>
+        </w:tc>
+        <w:tc>
+          <w:tcPr>
+            <w:tcW w:type="dxa" w:w="1037"/>
+            <w:vAlign w:val="center"/>
+            <w:tcMar>
+              <w:top w:w="75" w:type="dxa"/>
+              <w:bottom w:w="75" w:type="dxa"/>
+              <w:left w:w="75" w:type="dxa"/>
+              <w:right w:w="75" w:type="dxa"/>
+            </w:tcMar>
+            <w:shd w:fill="FFFFFF"/>
+          </w:tcPr>
+          <w:p>
+            <w:pPr>
+              <w:spacing w:before="0" w:after="60" w:line="276" w:lineRule="auto"/>
+              <w:ind w:firstLine="0"/>
+              <w:jc w:val="center"/>
+            </w:pPr>
+            <w:r>
+              <w:rPr>
+                <w:rFonts w:ascii="Times New Roman" w:hAnsi="Times New Roman" w:eastAsia="宋体"/>
+                <w:b w:val="0"/>
+                <w:color w:val="000000"/>
+                <w:sz w:val="21"/>
+              </w:rPr>
+              <w:t>M1</w:t>
+            </w:r>
+          </w:p>
+        </w:tc>
+        <w:tc>
+          <w:tcPr>
+            <w:tcW w:type="dxa" w:w="1037"/>
+            <w:vAlign w:val="center"/>
+            <w:tcMar>
+              <w:top w:w="75" w:type="dxa"/>
+              <w:bottom w:w="75" w:type="dxa"/>
+              <w:left w:w="75" w:type="dxa"/>
+              <w:right w:w="75" w:type="dxa"/>
+            </w:tcMar>
+            <w:shd w:fill="FFFFFF"/>
+          </w:tcPr>
+          <w:p>
+            <w:pPr>
+              <w:spacing w:before="0" w:after="60" w:line="276" w:lineRule="auto"/>
+              <w:ind w:firstLine="0"/>
+              <w:jc w:val="center"/>
+            </w:pPr>
+            <w:r>
+              <w:rPr>
+                <w:rFonts w:ascii="Times New Roman" w:hAnsi="Times New Roman" w:eastAsia="宋体"/>
+                <w:b w:val="0"/>
+                <w:color w:val="000000"/>
+                <w:sz w:val="21"/>
+              </w:rPr>
+              <w:t>EQ1</w:t>
+            </w:r>
+          </w:p>
+        </w:tc>
+        <w:tc>
+          <w:tcPr>
+            <w:tcW w:type="dxa" w:w="4320"/>
+            <w:vAlign w:val="center"/>
+            <w:tcMar>
+              <w:top w:w="75" w:type="dxa"/>
+              <w:bottom w:w="75" w:type="dxa"/>
+              <w:left w:w="75" w:type="dxa"/>
+              <w:right w:w="75" w:type="dxa"/>
+            </w:tcMar>
+            <w:shd w:fill="FFFFFF"/>
+          </w:tcPr>
+          <w:p>
+            <w:pPr>
+              <w:spacing w:before="0" w:after="60" w:line="276" w:lineRule="auto"/>
               <w:ind w:firstLine="0"/>
               <w:jc w:val="left"/>
             </w:pPr>
             <w:r>
               <w:rPr>
+                <w:rFonts w:ascii="Times New Roman" w:hAnsi="Times New Roman" w:eastAsia="宋体"/>
                 <w:b w:val="0"/>
-                <w:sz w:val="20"/>
+                <w:color w:val="000000"/>
+                <w:sz w:val="21"/>
               </w:rPr>
-              <w:t>M1 信息组织与呈现</w:t>
+              <w:t>进展与对象匹配；依据及时间范围；查找耗时</w:t>
             </w:r>
           </w:p>
         </w:tc>
+      </w:tr>
+      <w:tr>
+        <w:trPr/>
         <w:tc>
           <w:tcPr>
-            <w:tcW w:type="dxa" w:w="4252"/>
+            <w:tcW w:type="dxa" w:w="1310"/>
             <w:vAlign w:val="center"/>
             <w:tcMar>
-              <w:top w:w="85" w:type="dxa"/>
-              <w:bottom w:w="85" w:type="dxa"/>
-              <w:left w:w="100" w:type="dxa"/>
-              <w:right w:w="100" w:type="dxa"/>
+              <w:top w:w="75" w:type="dxa"/>
+              <w:bottom w:w="75" w:type="dxa"/>
+              <w:left w:w="75" w:type="dxa"/>
+              <w:right w:w="75" w:type="dxa"/>
             </w:tcMar>
+            <w:shd w:fill="FFFFFF"/>
           </w:tcPr>
           <w:p>
             <w:pPr>
-              <w:keepNext w:val="0"/>
-              <w:spacing w:after="0" w:line="300" w:lineRule="exact"/>
+              <w:spacing w:before="0" w:after="60" w:line="276" w:lineRule="auto"/>
               <w:ind w:firstLine="0"/>
               <w:jc w:val="left"/>
             </w:pPr>
             <w:r>
               <w:rPr>
+                <w:rFonts w:ascii="Times New Roman" w:hAnsi="Times New Roman" w:eastAsia="宋体"/>
                 <w:b w:val="0"/>
-                <w:sz w:val="20"/>
-              </w:rPr>
-              <w:t>状态判断、对象匹配、查找耗时</w:t>
-            </w:r>
-          </w:p>
-        </w:tc>
-      </w:tr>
-      <w:tr>
-        <w:trPr>
-          <w:cantSplit/>
-        </w:trPr>
-        <w:tc>
-          <w:tcPr>
-            <w:tcW w:type="dxa" w:w="1871"/>
-            <w:vAlign w:val="center"/>
-            <w:tcMar>
-              <w:top w:w="85" w:type="dxa"/>
-              <w:bottom w:w="85" w:type="dxa"/>
-              <w:left w:w="100" w:type="dxa"/>
-              <w:right w:w="100" w:type="dxa"/>
-            </w:tcMar>
-          </w:tcPr>
-          <w:p>
-            <w:pPr>
-              <w:keepNext w:val="0"/>
-              <w:spacing w:after="0" w:line="300" w:lineRule="exact"/>
-              <w:ind w:firstLine="0"/>
-              <w:jc w:val="center"/>
-            </w:pPr>
-            <w:r>
-              <w:rPr>
-                <w:b w:val="0"/>
-                <w:sz w:val="20"/>
+                <w:color w:val="000000"/>
+                <w:sz w:val="21"/>
               </w:rPr>
               <w:t>R2 变化与后续</w:t>
             </w:r>
@@ -1294,85 +1714,147 @@
         </w:tc>
         <w:tc>
           <w:tcPr>
-            <w:tcW w:type="dxa" w:w="2835"/>
+            <w:tcW w:type="dxa" w:w="1238"/>
             <w:vAlign w:val="center"/>
             <w:tcMar>
-              <w:top w:w="85" w:type="dxa"/>
-              <w:bottom w:w="85" w:type="dxa"/>
-              <w:left w:w="100" w:type="dxa"/>
-              <w:right w:w="100" w:type="dxa"/>
+              <w:top w:w="75" w:type="dxa"/>
+              <w:bottom w:w="75" w:type="dxa"/>
+              <w:left w:w="75" w:type="dxa"/>
+              <w:right w:w="75" w:type="dxa"/>
             </w:tcMar>
+            <w:shd w:fill="FFFFFF"/>
           </w:tcPr>
           <w:p>
             <w:pPr>
-              <w:keepNext w:val="0"/>
-              <w:spacing w:after="0" w:line="300" w:lineRule="exact"/>
+              <w:spacing w:before="0" w:after="60" w:line="276" w:lineRule="auto"/>
+              <w:ind w:firstLine="0"/>
+              <w:jc w:val="center"/>
+            </w:pPr>
+            <w:r>
+              <w:rPr>
+                <w:rFonts w:ascii="Times New Roman" w:hAnsi="Times New Roman" w:eastAsia="宋体"/>
+                <w:b w:val="0"/>
+                <w:color w:val="000000"/>
+                <w:sz w:val="21"/>
+              </w:rPr>
+              <w:t>S2—S6</w:t>
+            </w:r>
+          </w:p>
+        </w:tc>
+        <w:tc>
+          <w:tcPr>
+            <w:tcW w:type="dxa" w:w="1037"/>
+            <w:vAlign w:val="center"/>
+            <w:tcMar>
+              <w:top w:w="75" w:type="dxa"/>
+              <w:bottom w:w="75" w:type="dxa"/>
+              <w:left w:w="75" w:type="dxa"/>
+              <w:right w:w="75" w:type="dxa"/>
+            </w:tcMar>
+            <w:shd w:fill="FFFFFF"/>
+          </w:tcPr>
+          <w:p>
+            <w:pPr>
+              <w:spacing w:before="0" w:after="60" w:line="276" w:lineRule="auto"/>
+              <w:ind w:firstLine="0"/>
+              <w:jc w:val="center"/>
+            </w:pPr>
+            <w:r>
+              <w:rPr>
+                <w:rFonts w:ascii="Times New Roman" w:hAnsi="Times New Roman" w:eastAsia="宋体"/>
+                <w:b w:val="0"/>
+                <w:color w:val="000000"/>
+                <w:sz w:val="21"/>
+              </w:rPr>
+              <w:t>M1</w:t>
+            </w:r>
+          </w:p>
+        </w:tc>
+        <w:tc>
+          <w:tcPr>
+            <w:tcW w:type="dxa" w:w="1037"/>
+            <w:vAlign w:val="center"/>
+            <w:tcMar>
+              <w:top w:w="75" w:type="dxa"/>
+              <w:bottom w:w="75" w:type="dxa"/>
+              <w:left w:w="75" w:type="dxa"/>
+              <w:right w:w="75" w:type="dxa"/>
+            </w:tcMar>
+            <w:shd w:fill="FFFFFF"/>
+          </w:tcPr>
+          <w:p>
+            <w:pPr>
+              <w:spacing w:before="0" w:after="60" w:line="276" w:lineRule="auto"/>
+              <w:ind w:firstLine="0"/>
+              <w:jc w:val="center"/>
+            </w:pPr>
+            <w:r>
+              <w:rPr>
+                <w:rFonts w:ascii="Times New Roman" w:hAnsi="Times New Roman" w:eastAsia="宋体"/>
+                <w:b w:val="0"/>
+                <w:color w:val="000000"/>
+                <w:sz w:val="21"/>
+              </w:rPr>
+              <w:t>EQ1</w:t>
+            </w:r>
+          </w:p>
+        </w:tc>
+        <w:tc>
+          <w:tcPr>
+            <w:tcW w:type="dxa" w:w="4320"/>
+            <w:vAlign w:val="center"/>
+            <w:tcMar>
+              <w:top w:w="75" w:type="dxa"/>
+              <w:bottom w:w="75" w:type="dxa"/>
+              <w:left w:w="75" w:type="dxa"/>
+              <w:right w:w="75" w:type="dxa"/>
+            </w:tcMar>
+            <w:shd w:fill="FFFFFF"/>
+          </w:tcPr>
+          <w:p>
+            <w:pPr>
+              <w:spacing w:before="0" w:after="60" w:line="276" w:lineRule="auto"/>
               <w:ind w:firstLine="0"/>
               <w:jc w:val="left"/>
             </w:pPr>
             <w:r>
               <w:rPr>
+                <w:rFonts w:ascii="Times New Roman" w:hAnsi="Times New Roman" w:eastAsia="宋体"/>
                 <w:b w:val="0"/>
-                <w:sz w:val="20"/>
+                <w:color w:val="000000"/>
+                <w:sz w:val="21"/>
               </w:rPr>
-              <w:t>M1 信息组织与呈现</w:t>
+              <w:t>变化原因、影响及遗漏；已知与未知判断</w:t>
             </w:r>
           </w:p>
         </w:tc>
+      </w:tr>
+      <w:tr>
+        <w:trPr/>
         <w:tc>
           <w:tcPr>
-            <w:tcW w:type="dxa" w:w="4252"/>
+            <w:tcW w:type="dxa" w:w="1310"/>
             <w:vAlign w:val="center"/>
             <w:tcMar>
-              <w:top w:w="85" w:type="dxa"/>
-              <w:bottom w:w="85" w:type="dxa"/>
-              <w:left w:w="100" w:type="dxa"/>
-              <w:right w:w="100" w:type="dxa"/>
+              <w:top w:w="75" w:type="dxa"/>
+              <w:bottom w:w="75" w:type="dxa"/>
+              <w:left w:w="75" w:type="dxa"/>
+              <w:right w:w="75" w:type="dxa"/>
             </w:tcMar>
+            <w:shd w:fill="FFFFFF"/>
           </w:tcPr>
           <w:p>
             <w:pPr>
-              <w:keepNext w:val="0"/>
-              <w:spacing w:after="0" w:line="300" w:lineRule="exact"/>
+              <w:spacing w:before="0" w:after="60" w:line="276" w:lineRule="auto"/>
               <w:ind w:firstLine="0"/>
               <w:jc w:val="left"/>
             </w:pPr>
             <w:r>
               <w:rPr>
+                <w:rFonts w:ascii="Times New Roman" w:hAnsi="Times New Roman" w:eastAsia="宋体"/>
                 <w:b w:val="0"/>
-                <w:sz w:val="20"/>
-              </w:rPr>
-              <w:t>变化遗漏、过程与影响判断</w:t>
-            </w:r>
-          </w:p>
-        </w:tc>
-      </w:tr>
-      <w:tr>
-        <w:trPr>
-          <w:cantSplit/>
-        </w:trPr>
-        <w:tc>
-          <w:tcPr>
-            <w:tcW w:type="dxa" w:w="1871"/>
-            <w:vAlign w:val="center"/>
-            <w:tcMar>
-              <w:top w:w="85" w:type="dxa"/>
-              <w:bottom w:w="85" w:type="dxa"/>
-              <w:left w:w="100" w:type="dxa"/>
-              <w:right w:w="100" w:type="dxa"/>
-            </w:tcMar>
-          </w:tcPr>
-          <w:p>
-            <w:pPr>
-              <w:keepNext w:val="0"/>
-              <w:spacing w:after="0" w:line="300" w:lineRule="exact"/>
-              <w:ind w:firstLine="0"/>
-              <w:jc w:val="center"/>
-            </w:pPr>
-            <w:r>
-              <w:rPr>
-                <w:b w:val="0"/>
-                <w:sz w:val="20"/>
+                <w:color w:val="000000"/>
+                <w:sz w:val="21"/>
               </w:rPr>
               <w:t>R3 调整表达</w:t>
             </w:r>
@@ -1380,85 +1862,147 @@
         </w:tc>
         <w:tc>
           <w:tcPr>
-            <w:tcW w:type="dxa" w:w="2835"/>
+            <w:tcW w:type="dxa" w:w="1238"/>
             <w:vAlign w:val="center"/>
             <w:tcMar>
-              <w:top w:w="85" w:type="dxa"/>
-              <w:bottom w:w="85" w:type="dxa"/>
-              <w:left w:w="100" w:type="dxa"/>
-              <w:right w:w="100" w:type="dxa"/>
+              <w:top w:w="75" w:type="dxa"/>
+              <w:bottom w:w="75" w:type="dxa"/>
+              <w:left w:w="75" w:type="dxa"/>
+              <w:right w:w="75" w:type="dxa"/>
             </w:tcMar>
+            <w:shd w:fill="FFFFFF"/>
           </w:tcPr>
           <w:p>
             <w:pPr>
-              <w:keepNext w:val="0"/>
-              <w:spacing w:after="0" w:line="300" w:lineRule="exact"/>
+              <w:spacing w:before="0" w:after="60" w:line="276" w:lineRule="auto"/>
+              <w:ind w:firstLine="0"/>
+              <w:jc w:val="center"/>
+            </w:pPr>
+            <w:r>
+              <w:rPr>
+                <w:rFonts w:ascii="Times New Roman" w:hAnsi="Times New Roman" w:eastAsia="宋体"/>
+                <w:b w:val="0"/>
+                <w:color w:val="000000"/>
+                <w:sz w:val="21"/>
+              </w:rPr>
+              <w:t>S1、S3—S5</w:t>
+            </w:r>
+          </w:p>
+        </w:tc>
+        <w:tc>
+          <w:tcPr>
+            <w:tcW w:type="dxa" w:w="1037"/>
+            <w:vAlign w:val="center"/>
+            <w:tcMar>
+              <w:top w:w="75" w:type="dxa"/>
+              <w:bottom w:w="75" w:type="dxa"/>
+              <w:left w:w="75" w:type="dxa"/>
+              <w:right w:w="75" w:type="dxa"/>
+            </w:tcMar>
+            <w:shd w:fill="FFFFFF"/>
+          </w:tcPr>
+          <w:p>
+            <w:pPr>
+              <w:spacing w:before="0" w:after="60" w:line="276" w:lineRule="auto"/>
+              <w:ind w:firstLine="0"/>
+              <w:jc w:val="center"/>
+            </w:pPr>
+            <w:r>
+              <w:rPr>
+                <w:rFonts w:ascii="Times New Roman" w:hAnsi="Times New Roman" w:eastAsia="宋体"/>
+                <w:b w:val="0"/>
+                <w:color w:val="000000"/>
+                <w:sz w:val="21"/>
+              </w:rPr>
+              <w:t>M2</w:t>
+            </w:r>
+          </w:p>
+        </w:tc>
+        <w:tc>
+          <w:tcPr>
+            <w:tcW w:type="dxa" w:w="1037"/>
+            <w:vAlign w:val="center"/>
+            <w:tcMar>
+              <w:top w:w="75" w:type="dxa"/>
+              <w:bottom w:w="75" w:type="dxa"/>
+              <w:left w:w="75" w:type="dxa"/>
+              <w:right w:w="75" w:type="dxa"/>
+            </w:tcMar>
+            <w:shd w:fill="FFFFFF"/>
+          </w:tcPr>
+          <w:p>
+            <w:pPr>
+              <w:spacing w:before="0" w:after="60" w:line="276" w:lineRule="auto"/>
+              <w:ind w:firstLine="0"/>
+              <w:jc w:val="center"/>
+            </w:pPr>
+            <w:r>
+              <w:rPr>
+                <w:rFonts w:ascii="Times New Roman" w:hAnsi="Times New Roman" w:eastAsia="宋体"/>
+                <w:b w:val="0"/>
+                <w:color w:val="000000"/>
+                <w:sz w:val="21"/>
+              </w:rPr>
+              <w:t>EQ2</w:t>
+            </w:r>
+          </w:p>
+        </w:tc>
+        <w:tc>
+          <w:tcPr>
+            <w:tcW w:type="dxa" w:w="4320"/>
+            <w:vAlign w:val="center"/>
+            <w:tcMar>
+              <w:top w:w="75" w:type="dxa"/>
+              <w:bottom w:w="75" w:type="dxa"/>
+              <w:left w:w="75" w:type="dxa"/>
+              <w:right w:w="75" w:type="dxa"/>
+            </w:tcMar>
+            <w:shd w:fill="FFFFFF"/>
+          </w:tcPr>
+          <w:p>
+            <w:pPr>
+              <w:spacing w:before="0" w:after="60" w:line="276" w:lineRule="auto"/>
               <w:ind w:firstLine="0"/>
               <w:jc w:val="left"/>
             </w:pPr>
             <w:r>
               <w:rPr>
+                <w:rFonts w:ascii="Times New Roman" w:hAnsi="Times New Roman" w:eastAsia="宋体"/>
                 <w:b w:val="0"/>
-                <w:sz w:val="20"/>
+                <w:color w:val="000000"/>
+                <w:sz w:val="21"/>
               </w:rPr>
-              <w:t>M2 协同介入</w:t>
+              <w:t>对象、范围、约束和生效条件；解释修正</w:t>
             </w:r>
           </w:p>
         </w:tc>
+      </w:tr>
+      <w:tr>
+        <w:trPr/>
         <w:tc>
           <w:tcPr>
-            <w:tcW w:type="dxa" w:w="4252"/>
+            <w:tcW w:type="dxa" w:w="1310"/>
             <w:vAlign w:val="center"/>
             <w:tcMar>
-              <w:top w:w="85" w:type="dxa"/>
-              <w:bottom w:w="85" w:type="dxa"/>
-              <w:left w:w="100" w:type="dxa"/>
-              <w:right w:w="100" w:type="dxa"/>
+              <w:top w:w="75" w:type="dxa"/>
+              <w:bottom w:w="75" w:type="dxa"/>
+              <w:left w:w="75" w:type="dxa"/>
+              <w:right w:w="75" w:type="dxa"/>
             </w:tcMar>
+            <w:shd w:fill="FFFFFF"/>
           </w:tcPr>
           <w:p>
             <w:pPr>
-              <w:keepNext w:val="0"/>
-              <w:spacing w:after="0" w:line="300" w:lineRule="exact"/>
+              <w:spacing w:before="0" w:after="60" w:line="276" w:lineRule="auto"/>
               <w:ind w:firstLine="0"/>
               <w:jc w:val="left"/>
             </w:pPr>
             <w:r>
               <w:rPr>
+                <w:rFonts w:ascii="Times New Roman" w:hAnsi="Times New Roman" w:eastAsia="宋体"/>
                 <w:b w:val="0"/>
-                <w:sz w:val="20"/>
-              </w:rPr>
-              <w:t>对象、范围、约束与时间条件错误</w:t>
-            </w:r>
-          </w:p>
-        </w:tc>
-      </w:tr>
-      <w:tr>
-        <w:trPr>
-          <w:cantSplit/>
-        </w:trPr>
-        <w:tc>
-          <w:tcPr>
-            <w:tcW w:type="dxa" w:w="1871"/>
-            <w:vAlign w:val="center"/>
-            <w:tcMar>
-              <w:top w:w="85" w:type="dxa"/>
-              <w:bottom w:w="85" w:type="dxa"/>
-              <w:left w:w="100" w:type="dxa"/>
-              <w:right w:w="100" w:type="dxa"/>
-            </w:tcMar>
-          </w:tcPr>
-          <w:p>
-            <w:pPr>
-              <w:keepNext w:val="0"/>
-              <w:spacing w:after="0" w:line="300" w:lineRule="exact"/>
-              <w:ind w:firstLine="0"/>
-              <w:jc w:val="center"/>
-            </w:pPr>
-            <w:r>
-              <w:rPr>
-                <w:b w:val="0"/>
-                <w:sz w:val="20"/>
+                <w:color w:val="000000"/>
+                <w:sz w:val="21"/>
               </w:rPr>
               <w:t>R4 影响与介入</w:t>
             </w:r>
@@ -1466,85 +2010,147 @@
         </w:tc>
         <w:tc>
           <w:tcPr>
-            <w:tcW w:type="dxa" w:w="2835"/>
+            <w:tcW w:type="dxa" w:w="1238"/>
             <w:vAlign w:val="center"/>
             <w:tcMar>
-              <w:top w:w="85" w:type="dxa"/>
-              <w:bottom w:w="85" w:type="dxa"/>
-              <w:left w:w="100" w:type="dxa"/>
-              <w:right w:w="100" w:type="dxa"/>
+              <w:top w:w="75" w:type="dxa"/>
+              <w:bottom w:w="75" w:type="dxa"/>
+              <w:left w:w="75" w:type="dxa"/>
+              <w:right w:w="75" w:type="dxa"/>
             </w:tcMar>
+            <w:shd w:fill="FFFFFF"/>
           </w:tcPr>
           <w:p>
             <w:pPr>
-              <w:keepNext w:val="0"/>
-              <w:spacing w:after="0" w:line="300" w:lineRule="exact"/>
+              <w:spacing w:before="0" w:after="60" w:line="276" w:lineRule="auto"/>
+              <w:ind w:firstLine="0"/>
+              <w:jc w:val="center"/>
+            </w:pPr>
+            <w:r>
+              <w:rPr>
+                <w:rFonts w:ascii="Times New Roman" w:hAnsi="Times New Roman" w:eastAsia="宋体"/>
+                <w:b w:val="0"/>
+                <w:color w:val="000000"/>
+                <w:sz w:val="21"/>
+              </w:rPr>
+              <w:t>S2—S5</w:t>
+            </w:r>
+          </w:p>
+        </w:tc>
+        <w:tc>
+          <w:tcPr>
+            <w:tcW w:type="dxa" w:w="1037"/>
+            <w:vAlign w:val="center"/>
+            <w:tcMar>
+              <w:top w:w="75" w:type="dxa"/>
+              <w:bottom w:w="75" w:type="dxa"/>
+              <w:left w:w="75" w:type="dxa"/>
+              <w:right w:w="75" w:type="dxa"/>
+            </w:tcMar>
+            <w:shd w:fill="FFFFFF"/>
+          </w:tcPr>
+          <w:p>
+            <w:pPr>
+              <w:spacing w:before="0" w:after="60" w:line="276" w:lineRule="auto"/>
+              <w:ind w:firstLine="0"/>
+              <w:jc w:val="center"/>
+            </w:pPr>
+            <w:r>
+              <w:rPr>
+                <w:rFonts w:ascii="Times New Roman" w:hAnsi="Times New Roman" w:eastAsia="宋体"/>
+                <w:b w:val="0"/>
+                <w:color w:val="000000"/>
+                <w:sz w:val="21"/>
+              </w:rPr>
+              <w:t>M1、M2</w:t>
+            </w:r>
+          </w:p>
+        </w:tc>
+        <w:tc>
+          <w:tcPr>
+            <w:tcW w:type="dxa" w:w="1037"/>
+            <w:vAlign w:val="center"/>
+            <w:tcMar>
+              <w:top w:w="75" w:type="dxa"/>
+              <w:bottom w:w="75" w:type="dxa"/>
+              <w:left w:w="75" w:type="dxa"/>
+              <w:right w:w="75" w:type="dxa"/>
+            </w:tcMar>
+            <w:shd w:fill="FFFFFF"/>
+          </w:tcPr>
+          <w:p>
+            <w:pPr>
+              <w:spacing w:before="0" w:after="60" w:line="276" w:lineRule="auto"/>
+              <w:ind w:firstLine="0"/>
+              <w:jc w:val="center"/>
+            </w:pPr>
+            <w:r>
+              <w:rPr>
+                <w:rFonts w:ascii="Times New Roman" w:hAnsi="Times New Roman" w:eastAsia="宋体"/>
+                <w:b w:val="0"/>
+                <w:color w:val="000000"/>
+                <w:sz w:val="21"/>
+              </w:rPr>
+              <w:t>EQ1、EQ2</w:t>
+            </w:r>
+          </w:p>
+        </w:tc>
+        <w:tc>
+          <w:tcPr>
+            <w:tcW w:type="dxa" w:w="4320"/>
+            <w:vAlign w:val="center"/>
+            <w:tcMar>
+              <w:top w:w="75" w:type="dxa"/>
+              <w:bottom w:w="75" w:type="dxa"/>
+              <w:left w:w="75" w:type="dxa"/>
+              <w:right w:w="75" w:type="dxa"/>
+            </w:tcMar>
+            <w:shd w:fill="FFFFFF"/>
+          </w:tcPr>
+          <w:p>
+            <w:pPr>
+              <w:spacing w:before="0" w:after="60" w:line="276" w:lineRule="auto"/>
               <w:ind w:firstLine="0"/>
               <w:jc w:val="left"/>
             </w:pPr>
             <w:r>
               <w:rPr>
+                <w:rFonts w:ascii="Times New Roman" w:hAnsi="Times New Roman" w:eastAsia="宋体"/>
                 <w:b w:val="0"/>
-                <w:sz w:val="20"/>
+                <w:color w:val="000000"/>
+                <w:sz w:val="21"/>
               </w:rPr>
-              <w:t>M1与M2共同支持</w:t>
+              <w:t>保留与变化部分；合理介入、漏介入与误介入</w:t>
             </w:r>
           </w:p>
         </w:tc>
+      </w:tr>
+      <w:tr>
+        <w:trPr/>
         <w:tc>
           <w:tcPr>
-            <w:tcW w:type="dxa" w:w="4252"/>
+            <w:tcW w:type="dxa" w:w="1310"/>
             <w:vAlign w:val="center"/>
             <w:tcMar>
-              <w:top w:w="85" w:type="dxa"/>
-              <w:bottom w:w="85" w:type="dxa"/>
-              <w:left w:w="100" w:type="dxa"/>
-              <w:right w:w="100" w:type="dxa"/>
+              <w:top w:w="75" w:type="dxa"/>
+              <w:bottom w:w="75" w:type="dxa"/>
+              <w:left w:w="75" w:type="dxa"/>
+              <w:right w:w="75" w:type="dxa"/>
             </w:tcMar>
+            <w:shd w:fill="FFFFFF"/>
           </w:tcPr>
           <w:p>
             <w:pPr>
-              <w:keepNext w:val="0"/>
-              <w:spacing w:after="0" w:line="300" w:lineRule="exact"/>
+              <w:spacing w:before="0" w:after="60" w:line="276" w:lineRule="auto"/>
               <w:ind w:firstLine="0"/>
               <w:jc w:val="left"/>
             </w:pPr>
             <w:r>
               <w:rPr>
+                <w:rFonts w:ascii="Times New Roman" w:hAnsi="Times New Roman" w:eastAsia="宋体"/>
                 <w:b w:val="0"/>
-                <w:sz w:val="20"/>
-              </w:rPr>
-              <w:t>影响判断、漏介入与误介入</w:t>
-            </w:r>
-          </w:p>
-        </w:tc>
-      </w:tr>
-      <w:tr>
-        <w:trPr>
-          <w:cantSplit/>
-        </w:trPr>
-        <w:tc>
-          <w:tcPr>
-            <w:tcW w:type="dxa" w:w="1871"/>
-            <w:vAlign w:val="center"/>
-            <w:tcMar>
-              <w:top w:w="85" w:type="dxa"/>
-              <w:bottom w:w="85" w:type="dxa"/>
-              <w:left w:w="100" w:type="dxa"/>
-              <w:right w:w="100" w:type="dxa"/>
-            </w:tcMar>
-          </w:tcPr>
-          <w:p>
-            <w:pPr>
-              <w:keepNext w:val="0"/>
-              <w:spacing w:after="0" w:line="300" w:lineRule="exact"/>
-              <w:ind w:firstLine="0"/>
-              <w:jc w:val="center"/>
-            </w:pPr>
-            <w:r>
-              <w:rPr>
-                <w:b w:val="0"/>
-                <w:sz w:val="20"/>
+                <w:color w:val="000000"/>
+                <w:sz w:val="21"/>
               </w:rPr>
               <w:t>R5 落实与衔接</w:t>
             </w:r>
@@ -1552,55 +2158,117 @@
         </w:tc>
         <w:tc>
           <w:tcPr>
-            <w:tcW w:type="dxa" w:w="2835"/>
+            <w:tcW w:type="dxa" w:w="1238"/>
             <w:vAlign w:val="center"/>
             <w:tcMar>
-              <w:top w:w="85" w:type="dxa"/>
-              <w:bottom w:w="85" w:type="dxa"/>
-              <w:left w:w="100" w:type="dxa"/>
-              <w:right w:w="100" w:type="dxa"/>
+              <w:top w:w="75" w:type="dxa"/>
+              <w:bottom w:w="75" w:type="dxa"/>
+              <w:left w:w="75" w:type="dxa"/>
+              <w:right w:w="75" w:type="dxa"/>
             </w:tcMar>
+            <w:shd w:fill="FFFFFF"/>
           </w:tcPr>
           <w:p>
             <w:pPr>
-              <w:keepNext w:val="0"/>
-              <w:spacing w:after="0" w:line="300" w:lineRule="exact"/>
+              <w:spacing w:before="0" w:after="60" w:line="276" w:lineRule="auto"/>
+              <w:ind w:firstLine="0"/>
+              <w:jc w:val="center"/>
+            </w:pPr>
+            <w:r>
+              <w:rPr>
+                <w:rFonts w:ascii="Times New Roman" w:hAnsi="Times New Roman" w:eastAsia="宋体"/>
+                <w:b w:val="0"/>
+                <w:color w:val="000000"/>
+                <w:sz w:val="21"/>
+              </w:rPr>
+              <w:t>S3—S6</w:t>
+            </w:r>
+          </w:p>
+        </w:tc>
+        <w:tc>
+          <w:tcPr>
+            <w:tcW w:type="dxa" w:w="1037"/>
+            <w:vAlign w:val="center"/>
+            <w:tcMar>
+              <w:top w:w="75" w:type="dxa"/>
+              <w:bottom w:w="75" w:type="dxa"/>
+              <w:left w:w="75" w:type="dxa"/>
+              <w:right w:w="75" w:type="dxa"/>
+            </w:tcMar>
+            <w:shd w:fill="FFFFFF"/>
+          </w:tcPr>
+          <w:p>
+            <w:pPr>
+              <w:spacing w:before="0" w:after="60" w:line="276" w:lineRule="auto"/>
+              <w:ind w:firstLine="0"/>
+              <w:jc w:val="center"/>
+            </w:pPr>
+            <w:r>
+              <w:rPr>
+                <w:rFonts w:ascii="Times New Roman" w:hAnsi="Times New Roman" w:eastAsia="宋体"/>
+                <w:b w:val="0"/>
+                <w:color w:val="000000"/>
+                <w:sz w:val="21"/>
+              </w:rPr>
+              <w:t>M3</w:t>
+            </w:r>
+          </w:p>
+        </w:tc>
+        <w:tc>
+          <w:tcPr>
+            <w:tcW w:type="dxa" w:w="1037"/>
+            <w:vAlign w:val="center"/>
+            <w:tcMar>
+              <w:top w:w="75" w:type="dxa"/>
+              <w:bottom w:w="75" w:type="dxa"/>
+              <w:left w:w="75" w:type="dxa"/>
+              <w:right w:w="75" w:type="dxa"/>
+            </w:tcMar>
+            <w:shd w:fill="FFFFFF"/>
+          </w:tcPr>
+          <w:p>
+            <w:pPr>
+              <w:spacing w:before="0" w:after="60" w:line="276" w:lineRule="auto"/>
+              <w:ind w:firstLine="0"/>
+              <w:jc w:val="center"/>
+            </w:pPr>
+            <w:r>
+              <w:rPr>
+                <w:rFonts w:ascii="Times New Roman" w:hAnsi="Times New Roman" w:eastAsia="宋体"/>
+                <w:b w:val="0"/>
+                <w:color w:val="000000"/>
+                <w:sz w:val="21"/>
+              </w:rPr>
+              <w:t>EQ2</w:t>
+            </w:r>
+          </w:p>
+        </w:tc>
+        <w:tc>
+          <w:tcPr>
+            <w:tcW w:type="dxa" w:w="4320"/>
+            <w:vAlign w:val="center"/>
+            <w:tcMar>
+              <w:top w:w="75" w:type="dxa"/>
+              <w:bottom w:w="75" w:type="dxa"/>
+              <w:left w:w="75" w:type="dxa"/>
+              <w:right w:w="75" w:type="dxa"/>
+            </w:tcMar>
+            <w:shd w:fill="FFFFFF"/>
+          </w:tcPr>
+          <w:p>
+            <w:pPr>
+              <w:spacing w:before="0" w:after="60" w:line="276" w:lineRule="auto"/>
               <w:ind w:firstLine="0"/>
               <w:jc w:val="left"/>
             </w:pPr>
             <w:r>
               <w:rPr>
+                <w:rFonts w:ascii="Times New Roman" w:hAnsi="Times New Roman" w:eastAsia="宋体"/>
                 <w:b w:val="0"/>
-                <w:sz w:val="20"/>
+                <w:color w:val="000000"/>
+                <w:sz w:val="21"/>
               </w:rPr>
-              <w:t>M3 执行衔接与反馈</w:t>
-            </w:r>
-          </w:p>
-        </w:tc>
-        <w:tc>
-          <w:tcPr>
-            <w:tcW w:type="dxa" w:w="4252"/>
-            <w:vAlign w:val="center"/>
-            <w:tcMar>
-              <w:top w:w="85" w:type="dxa"/>
-              <w:bottom w:w="85" w:type="dxa"/>
-              <w:left w:w="100" w:type="dxa"/>
-              <w:right w:w="100" w:type="dxa"/>
-            </w:tcMar>
-          </w:tcPr>
-          <w:p>
-            <w:pPr>
-              <w:keepNext w:val="0"/>
-              <w:spacing w:after="0" w:line="300" w:lineRule="exact"/>
-              <w:ind w:firstLine="0"/>
-              <w:jc w:val="left"/>
-            </w:pPr>
-            <w:r>
-              <w:rPr>
-                <w:b w:val="0"/>
-                <w:sz w:val="20"/>
-              </w:rPr>
-              <w:t>落实判断、错误确认与后续操作</w:t>
+              <w:t>按要求判断落实；部分或未知反馈；后续操作</w:t>
             </w:r>
           </w:p>
         </w:tc>
@@ -1616,7 +2284,7 @@
         <w:jc w:val="both"/>
       </w:pPr>
       <w:r>
-        <w:t>后续评价拟在相同任务事实、后台能力、基本操作和必要反馈条件下，比较合理常规方案与本文交互方案。整体对照用于回答任务理解与有效介入两个研究目标；若进一步选定某项空间交互机制，则通过针对性比较检验其增量作用。支撑交互的实现方法可另行检验响应、状态关联和恢复表现，并说明这些技术结果与用户任务的联系。</w:t>
+        <w:t>后续评价拟在相同任务事实、后台智能体能力、基本操作和必要反馈条件下，比较合理常规方案与本文交互方案。常规方案可组合地图、任务列表、消息或事件记录和调整入口，本文方案改变过程信息的组织、任务与空间对象的关联以及参与和反馈的衔接。基线不能故意省略理解确认、必要解释或操作反馈；也不将不同后台能力造成的差异归因于交互设计。整体对照回答EQ1和EQ2，单项机制的作用另需针对性比较。</w:t>
       </w:r>
     </w:p>
     <w:p>
@@ -1624,7 +2292,7 @@
         <w:jc w:val="both"/>
       </w:pPr>
       <w:r>
-        <w:t>需求核查优先落实目标用户的职责边界、空间对象及任务数据的可得性、允许调整的范围与生效条件，以及两个重点场景中的合理处理方式。业务走查据此修订需求和案例，原型评价再检查设计是否改善理解与操作。系统持续运行、短时人员任务和人员长期监督分别报告，以保持研究结论与实际证据范围一致。</w:t>
+        <w:t>需求核查优先落实目标用户职责、必要数据的可得性、允许调整的范围与生效条件，以及两个重点案例中的合理处理方式。用户判断按决策时可获得的证据评分，后台真值另用于验证实际执行；合理的未知判断不因事后获得新信息而判错。业务走查修订需求与案例，功能验证检查关联正确性，用户评价再检验理解与操作表现。</w:t>
       </w:r>
     </w:p>
     <w:p>
@@ -1632,6 +2300,9 @@
         <w:pStyle w:val="Heading1"/>
       </w:pPr>
       <w:r>
+        <w:rPr>
+          <w:color w:val="000000"/>
+        </w:rPr>
         <w:t>参考文献</w:t>
       </w:r>
     </w:p>
@@ -1683,6 +2354,41 @@
     </w:sectPr>
   </w:body>
 </w:document>
+</file>
+
+<file path=word/comments.xml><?xml version="1.0" encoding="utf-8"?>
+<w:comments xmlns:a="http://schemas.openxmlformats.org/drawingml/2006/main" xmlns:pic="http://schemas.openxmlformats.org/drawingml/2006/picture" xmlns:r="http://schemas.openxmlformats.org/officeDocument/2006/relationships" xmlns:w="http://schemas.openxmlformats.org/wordprocessingml/2006/main" xmlns:wp="http://schemas.openxmlformats.org/drawingml/2006/wordprocessingDrawing" xmlns:mc="http://schemas.openxmlformats.org/markup-compatibility/2006" xmlns:a14="http://schemas.microsoft.com/office/drawing/2010/main" xmlns:w14="http://schemas.microsoft.com/office/word/2010/wordml" xmlns:wpc="http://schemas.microsoft.com/office/word/2010/wordprocessingCanvas">
+  <w:comment w:id="0" w:author="论文修订" w:initials="REV" w:date="2026-09-14T06:59:08Z">
+    <w:p>
+      <w:pPr>
+        <w:pStyle w:val="CommentText"/>
+      </w:pPr>
+      <w:r>
+        <w:t>按用户确认的研究起点修订：从目标委托、Agent持续输出到过程理解与用户参与；避免把研究背景写成设备状态核查。</w:t>
+      </w:r>
+    </w:p>
+  </w:comment>
+  <w:comment w:id="1" w:author="论文修订" w:initials="REV" w:date="2026-09-14T06:59:08Z">
+    <w:p>
+      <w:pPr>
+        <w:pStyle w:val="CommentText"/>
+      </w:pPr>
+      <w:r>
+        <w:t>变化解释和信息时间作为过程理解的支撑要求，不将状态证据单独提升为全文主线。</w:t>
+      </w:r>
+    </w:p>
+  </w:comment>
+  <w:comment w:id="2" w:author="论文修订" w:initials="REV" w:date="2026-09-14T06:59:08Z">
+    <w:p>
+      <w:pPr>
+        <w:pStyle w:val="CommentText"/>
+      </w:pPr>
+      <w:r>
+        <w:t>总体框架按信息组织、用户参与、执行反馈说明；数据标识、运行生命周期等实现细节留到第5章。</w:t>
+      </w:r>
+    </w:p>
+  </w:comment>
+</w:comments>
 </file>
 
 <file path=word/footer1.xml><?xml version="1.0" encoding="utf-8"?>

</xml_diff>